<commit_message>
Analyza tvorby priestoru pre hry
</commit_message>
<xml_diff>
--- a/IT_hodiny/namety_postupu_skolenia.docx
+++ b/IT_hodiny/namety_postupu_skolenia.docx
@@ -47,7 +47,7 @@
       </w:r>
     </w:p>
     <w:p>
-      <w:hyperlink r:id="rId6" w:history="1">
+      <w:hyperlink r:id="rId7" w:history="1">
         <w:r>
           <w:rPr>
             <w:rStyle w:val="Hyperlink"/>
@@ -69,7 +69,7 @@
       </w:r>
     </w:p>
     <w:p>
-      <w:hyperlink r:id="rId7" w:history="1">
+      <w:hyperlink r:id="rId8" w:history="1">
         <w:r>
           <w:rPr>
             <w:rStyle w:val="Hyperlink"/>
@@ -179,7 +179,7 @@
       </w:r>
     </w:p>
     <w:p>
-      <w:hyperlink r:id="rId8" w:history="1">
+      <w:hyperlink r:id="rId9" w:history="1">
         <w:r>
           <w:rPr>
             <w:rStyle w:val="Hyperlink"/>
@@ -323,7 +323,7 @@
       </w:r>
     </w:p>
     <w:p>
-      <w:hyperlink r:id="rId9" w:history="1">
+      <w:hyperlink r:id="rId10" w:history="1">
         <w:r>
           <w:rPr>
             <w:rStyle w:val="Hyperlink"/>
@@ -335,9 +335,410 @@
         <w:t xml:space="preserve"> </w:t>
       </w:r>
     </w:p>
+    <w:p>
+      <w:hyperlink r:id="rId11" w:history="1">
+        <w:r>
+          <w:rPr>
+            <w:rStyle w:val="Hyperlink"/>
+            <w:highlight w:val="yellow"/>
+          </w:rPr>
+          <w:t>https://www.geeksforgeeks.org/python/pygame-tutorial/</w:t>
+        </w:r>
+      </w:hyperlink>
+      <w:r>
+        <w:t xml:space="preserve"> </w:t>
+      </w:r>
+    </w:p>
+    <w:p/>
+    <w:p>
+      <w:pPr>
+        <w:rPr>
+          <w:b/>
+          <w:bCs/>
+        </w:rPr>
+      </w:pPr>
+      <w:r>
+        <w:rPr>
+          <w:b/>
+          <w:bCs/>
+        </w:rPr>
+        <w:t>Preskúmajte kódex</w:t>
+      </w:r>
+      <w:r>
+        <w:rPr>
+          <w:b/>
+          <w:bCs/>
+        </w:rPr>
+        <w:t xml:space="preserve"> – program </w:t>
+      </w:r>
+      <w:r>
+        <w:rPr>
+          <w:b/>
+          <w:bCs/>
+        </w:rPr>
+        <w:t>zaklad.py</w:t>
+      </w:r>
+    </w:p>
+    <w:p>
+      <w:r>
+        <w:t>Na spustenie hry musia byť všetky potrebné moduly Pygame inicializované pomocou pygame.init().</w:t>
+      </w:r>
+    </w:p>
+    <w:p>
+      <w:pPr>
+        <w:rPr>
+          <w:b/>
+          <w:bCs/>
+        </w:rPr>
+      </w:pPr>
+      <w:r>
+        <w:rPr>
+          <w:b/>
+          <w:bCs/>
+        </w:rPr>
+        <w:t>Konfigurácia herného okna:</w:t>
+      </w:r>
+    </w:p>
+    <w:p>
+      <w:r>
+        <w:t xml:space="preserve">Funkcia </w:t>
+      </w:r>
+      <w:r>
+        <w:rPr>
+          <w:b/>
+          <w:bCs/>
+        </w:rPr>
+        <w:t>pygame.display.set_mode()</w:t>
+      </w:r>
+      <w:r>
+        <w:t xml:space="preserve"> vytvorí okno s danou výškou a šírkou. Toto okno bude slúžiť ako plátno pre vašu hru, na ktoré nakreslíte každý prvok.</w:t>
+      </w:r>
+    </w:p>
+    <w:p>
+      <w:r>
+        <w:t>Názov okna sa nastavuje pomocou</w:t>
+      </w:r>
+      <w:r>
+        <w:rPr>
+          <w:b/>
+          <w:bCs/>
+          <w:i/>
+          <w:iCs/>
+        </w:rPr>
+        <w:t xml:space="preserve"> pygame.display.set_caption().</w:t>
+      </w:r>
+    </w:p>
+    <w:p>
+      <w:pPr>
+        <w:rPr>
+          <w:b/>
+          <w:bCs/>
+        </w:rPr>
+      </w:pPr>
+      <w:r>
+        <w:rPr>
+          <w:b/>
+          <w:bCs/>
+        </w:rPr>
+        <w:t>FPS a herné hodiny:</w:t>
+      </w:r>
+    </w:p>
+    <w:p>
+      <w:r>
+        <w:t>pygame.time</w:t>
+      </w:r>
+      <w:r>
+        <w:t xml:space="preserve"> pri</w:t>
+      </w:r>
+      <w:r>
+        <w:t xml:space="preserve"> vytvorení objektu hodín vám Clock() dáva možnosť upraviť snímkovú frekvenciu hernej slučky.</w:t>
+      </w:r>
+    </w:p>
+    <w:p>
+      <w:r>
+        <w:t>Hra má zaručenú prevádzku pri 60 snímkach za sekundu (FPS) vďaka clock.tick(60).</w:t>
+      </w:r>
+    </w:p>
+    <w:p>
+      <w:pPr>
+        <w:rPr>
+          <w:b/>
+          <w:bCs/>
+        </w:rPr>
+      </w:pPr>
+      <w:r>
+        <w:rPr>
+          <w:b/>
+          <w:bCs/>
+        </w:rPr>
+        <w:t>Slučka hlavnej hry</w:t>
+      </w:r>
+    </w:p>
+    <w:p>
+      <w:r>
+        <w:t>Hru udržiava slučka while True. Vo vnútri kód aktualizuje obrazovku hry, prekresľuje položky a počúva akcie (napríklad zatvorenie okna).</w:t>
+      </w:r>
+    </w:p>
+    <w:p>
+      <w:r>
+        <w:t>Všetky udalosti vrátane stlačení klávesov, kliknutí myšou a udalostí zatvorenia okien načíta pygame.event.get(). Hra sa skončí, ak sa udalosť uzavrela (pygame. QUIT).</w:t>
+      </w:r>
+    </w:p>
+    <w:p>
+      <w:pPr>
+        <w:rPr>
+          <w:b/>
+          <w:bCs/>
+        </w:rPr>
+      </w:pPr>
+      <w:r>
+        <w:rPr>
+          <w:b/>
+          <w:bCs/>
+        </w:rPr>
+        <w:t>Aktualizácie obrazovky a vykresľovania:</w:t>
+      </w:r>
+    </w:p>
+    <w:p>
+      <w:r>
+        <w:t>Screen.fill (WHITE) vyplní obrazovku konkrétnou farbou. Nakoniec tu nakreslíte pozadia, objekty alebo škriatkov.</w:t>
+      </w:r>
+    </w:p>
+    <w:p>
+      <w:r>
+        <w:t>Všetky zmeny vykonané počas slučky sa aktualizujú na obrazovke pomocou pygame.display.flip().</w:t>
+      </w:r>
+    </w:p>
+    <w:p/>
+    <w:p>
+      <w:pPr>
+        <w:pStyle w:val="Heading2"/>
+      </w:pPr>
+      <w:r>
+        <w:t>Pohyb.</w:t>
+      </w:r>
+    </w:p>
+    <w:p>
+      <w:pPr>
+        <w:rPr>
+          <w:b/>
+          <w:bCs/>
+        </w:rPr>
+      </w:pPr>
+      <w:r>
+        <w:rPr>
+          <w:b/>
+          <w:bCs/>
+        </w:rPr>
+        <w:t>Konfigurácia hráča:</w:t>
+      </w:r>
+      <w:r>
+        <w:rPr>
+          <w:b/>
+          <w:bCs/>
+        </w:rPr>
+        <w:t xml:space="preserve"> - praktický proklad v programe </w:t>
+      </w:r>
+      <w:r>
+        <w:rPr>
+          <w:b/>
+          <w:bCs/>
+        </w:rPr>
+        <w:t>pohyb.py</w:t>
+      </w:r>
+    </w:p>
+    <w:p>
+      <w:pPr>
+        <w:numPr>
+          <w:ilvl w:val="0"/>
+          <w:numId w:val="21"/>
+        </w:numPr>
+      </w:pPr>
+      <w:r>
+        <w:t>Bol predstavený hráč; Predstavuje ho obdĺžnik, ktorý je vycentrovaný na obrazovke. Prehrávač má veľkosť 50x50 pixelov.</w:t>
+      </w:r>
+    </w:p>
+    <w:p>
+      <w:pPr>
+        <w:numPr>
+          <w:ilvl w:val="0"/>
+          <w:numId w:val="21"/>
+        </w:numPr>
+      </w:pPr>
+      <w:r>
+        <w:t xml:space="preserve">Pozícia hráča je určená </w:t>
+      </w:r>
+      <w:r>
+        <w:rPr>
+          <w:b/>
+          <w:bCs/>
+          <w:i/>
+          <w:iCs/>
+        </w:rPr>
+        <w:t>player_x a player_y</w:t>
+      </w:r>
+      <w:r>
+        <w:t>, zatiaľ čo jeho rýchlosť je riadená player_speed.</w:t>
+      </w:r>
+    </w:p>
+    <w:p>
+      <w:pPr>
+        <w:rPr>
+          <w:b/>
+          <w:bCs/>
+        </w:rPr>
+      </w:pPr>
+      <w:r>
+        <w:rPr>
+          <w:b/>
+          <w:bCs/>
+        </w:rPr>
+        <w:t>Správa vstupu:</w:t>
+      </w:r>
+    </w:p>
+    <w:p>
+      <w:pPr>
+        <w:numPr>
+          <w:ilvl w:val="0"/>
+          <w:numId w:val="31"/>
+        </w:numPr>
+      </w:pPr>
+      <w:r>
+        <w:t xml:space="preserve">Funkcia </w:t>
+      </w:r>
+      <w:r>
+        <w:rPr>
+          <w:b/>
+          <w:bCs/>
+          <w:i/>
+          <w:iCs/>
+        </w:rPr>
+        <w:t xml:space="preserve">pygame.key.get_pressed() </w:t>
+      </w:r>
+      <w:r>
+        <w:t>určuje, ktoré klávesy sú v danom okamihu stlačené.</w:t>
+      </w:r>
+    </w:p>
+    <w:p>
+      <w:pPr>
+        <w:numPr>
+          <w:ilvl w:val="0"/>
+          <w:numId w:val="31"/>
+        </w:numPr>
+      </w:pPr>
+      <w:r>
+        <w:t>Príkazy if upravujú pozície x a y hráča podľa toho, či sú stlačené klávesy so šípkami.</w:t>
+      </w:r>
+    </w:p>
+    <w:p>
+      <w:pPr>
+        <w:rPr>
+          <w:b/>
+          <w:bCs/>
+        </w:rPr>
+      </w:pPr>
+      <w:r>
+        <w:rPr>
+          <w:b/>
+          <w:bCs/>
+        </w:rPr>
+        <w:t>Skicovanie účastníka:</w:t>
+      </w:r>
+    </w:p>
+    <w:p>
+      <w:pPr>
+        <w:numPr>
+          <w:ilvl w:val="0"/>
+          <w:numId w:val="32"/>
+        </w:numPr>
+      </w:pPr>
+      <w:r>
+        <w:t>Hráč je reprezentovaný čiernym obdĺžnikom nakresleným na obrazovke na aktuálnej pozícii hráča pomocou pygame.draw.rect().</w:t>
+      </w:r>
+    </w:p>
+    <w:p/>
+    <w:p>
+      <w:r>
+        <w:t>V príspevku sa rozoberá aj zvuk hry. Nebudeme to robiť teraz.</w:t>
+      </w:r>
+    </w:p>
+    <w:p/>
+    <w:p>
+      <w:pPr>
+        <w:pStyle w:val="Heading2"/>
+      </w:pPr>
+      <w:r>
+        <w:t>Povolenie zmeny veľkosti okna v PyGame.</w:t>
+      </w:r>
+    </w:p>
+    <w:p>
+      <w:r>
+        <w:t>Povolenie zväčšovanie okna sa zabezpečí doplnením príkazu</w:t>
+      </w:r>
+    </w:p>
+    <w:p>
+      <w:pPr>
+        <w:rPr>
+          <w:rFonts w:ascii="Courier New" w:hAnsi="Courier New" w:cs="Courier New"/>
+          <w:sz w:val="20"/>
+          <w:szCs w:val="20"/>
+        </w:rPr>
+      </w:pPr>
+      <w:r>
+        <w:rPr>
+          <w:rFonts w:ascii="Courier New" w:hAnsi="Courier New" w:cs="Courier New"/>
+          <w:sz w:val="20"/>
+          <w:szCs w:val="20"/>
+        </w:rPr>
+        <w:t>screen = pygame.display.set_mode((400, 400), pygame.RESIZABLE)</w:t>
+      </w:r>
+    </w:p>
+    <w:p>
+      <w:r>
+        <w:t>predtým</w:t>
+      </w:r>
+    </w:p>
+    <w:p/>
+    <w:p>
+      <w:pPr>
+        <w:rPr>
+          <w:rFonts w:ascii="Courier New" w:hAnsi="Courier New" w:cs="Courier New"/>
+          <w:sz w:val="20"/>
+          <w:szCs w:val="20"/>
+        </w:rPr>
+      </w:pPr>
+      <w:r>
+        <w:rPr>
+          <w:rFonts w:ascii="Courier New" w:hAnsi="Courier New" w:cs="Courier New"/>
+          <w:sz w:val="20"/>
+          <w:szCs w:val="20"/>
+        </w:rPr>
+        <w:t>screen = pygame.display.set_mode((400, 400))</w:t>
+      </w:r>
+    </w:p>
+    <w:p/>
+    <w:p>
+      <w:pPr>
+        <w:pStyle w:val="Heading2"/>
+      </w:pPr>
+      <w:r>
+        <w:t>Ako zmeniť farbu pozadia obrazovky v Pygame?</w:t>
+      </w:r>
+    </w:p>
+    <w:p>
+      <w:r>
+        <w:t xml:space="preserve">Vysvetlenie v programe </w:t>
+      </w:r>
+      <w:r>
+        <w:t>farba_pozadia.py</w:t>
+      </w:r>
+      <w:r>
+        <w:t>.</w:t>
+      </w:r>
+    </w:p>
     <w:p/>
     <w:sectPr>
-      <w:footerReference w:type="default" r:id="rId10"/>
+      <w:footerReference w:type="default" r:id="rId12"/>
       <w:pgSz w:w="11906" w:h="16838"/>
       <w:pgMar w:top="1440" w:right="1440" w:bottom="1440" w:left="1440" w:header="708" w:footer="708" w:gutter="0"/>
       <w:cols w:space="708"/>
@@ -426,6 +827,2313 @@
     </w:p>
   </w:footnote>
 </w:footnotes>
+</file>
+
+<file path=word/numbering.xml><?xml version="1.0" encoding="utf-8"?>
+<w:numbering xmlns:wpc="http://schemas.microsoft.com/office/word/2010/wordprocessingCanvas" xmlns:cx="http://schemas.microsoft.com/office/drawing/2014/chartex" xmlns:cx1="http://schemas.microsoft.com/office/drawing/2015/9/8/chartex" xmlns:cx2="http://schemas.microsoft.com/office/drawing/2015/10/21/chartex" xmlns:cx3="http://schemas.microsoft.com/office/drawing/2016/5/9/chartex" xmlns:cx4="http://schemas.microsoft.com/office/drawing/2016/5/10/chartex" xmlns:cx5="http://schemas.microsoft.com/office/drawing/2016/5/11/chartex" xmlns:cx6="http://schemas.microsoft.com/office/drawing/2016/5/12/chartex" xmlns:cx7="http://schemas.microsoft.com/office/drawing/2016/5/13/chartex" xmlns:cx8="http://schemas.microsoft.com/office/drawing/2016/5/14/chartex" xmlns:mc="http://schemas.openxmlformats.org/markup-compatibility/2006" xmlns:aink="http://schemas.microsoft.com/office/drawing/2016/ink" xmlns:am3d="http://schemas.microsoft.com/office/drawing/2017/model3d" xmlns:o="urn:schemas-microsoft-com:office:office" xmlns:oel="http://schemas.microsoft.com/office/2019/extlst" xmlns:r="http://schemas.openxmlformats.org/officeDocument/2006/relationships" xmlns:m="http://schemas.openxmlformats.org/officeDocument/2006/math" xmlns:v="urn:schemas-microsoft-com:vml" xmlns:wp14="http://schemas.microsoft.com/office/word/2010/wordprocessingDrawing" xmlns:wp="http://schemas.openxmlformats.org/drawingml/2006/wordprocessingDrawing" xmlns:w10="urn:schemas-microsoft-com:office:word" xmlns:w="http://schemas.openxmlformats.org/wordprocessingml/2006/main" xmlns:w14="http://schemas.microsoft.com/office/word/2010/wordml" xmlns:w15="http://schemas.microsoft.com/office/word/2012/wordml" xmlns:w16cex="http://schemas.microsoft.com/office/word/2018/wordml/cex" xmlns:w16cid="http://schemas.microsoft.com/office/word/2016/wordml/cid" xmlns:w16="http://schemas.microsoft.com/office/word/2018/wordml" xmlns:w16du="http://schemas.microsoft.com/office/word/2023/wordml/word16du" xmlns:w16sdtdh="http://schemas.microsoft.com/office/word/2020/wordml/sdtdatahash" xmlns:w16sdtfl="http://schemas.microsoft.com/office/word/2024/wordml/sdtformatlock" xmlns:w16se="http://schemas.microsoft.com/office/word/2015/wordml/symex" xmlns:wpg="http://schemas.microsoft.com/office/word/2010/wordprocessingGroup" xmlns:wpi="http://schemas.microsoft.com/office/word/2010/wordprocessingInk" xmlns:wne="http://schemas.microsoft.com/office/word/2006/wordml" xmlns:wps="http://schemas.microsoft.com/office/word/2010/wordprocessingShape" mc:Ignorable="w14 w15 w16se w16cid w16 w16cex w16sdtdh w16sdtfl w16du wp14">
+  <w:abstractNum w:abstractNumId="0" w15:restartNumberingAfterBreak="0">
+    <w:nsid w:val="00B96955"/>
+    <w:multiLevelType w:val="multilevel"/>
+    <w:tmpl w:val="2C2AA8F4"/>
+    <w:lvl w:ilvl="0">
+      <w:start w:val="1"/>
+      <w:numFmt w:val="bullet"/>
+      <w:lvlText w:val=""/>
+      <w:lvlJc w:val="left"/>
+      <w:pPr>
+        <w:tabs>
+          <w:tab w:val="num" w:pos="720"/>
+        </w:tabs>
+        <w:ind w:left="720" w:hanging="720"/>
+      </w:pPr>
+      <w:rPr>
+        <w:rFonts w:ascii="Symbol" w:hAnsi="Symbol" w:hint="default"/>
+      </w:rPr>
+    </w:lvl>
+    <w:lvl w:ilvl="1">
+      <w:start w:val="1"/>
+      <w:numFmt w:val="decimal"/>
+      <w:lvlText w:val="%2."/>
+      <w:lvlJc w:val="left"/>
+      <w:pPr>
+        <w:tabs>
+          <w:tab w:val="num" w:pos="1440"/>
+        </w:tabs>
+        <w:ind w:left="1440" w:hanging="720"/>
+      </w:pPr>
+    </w:lvl>
+    <w:lvl w:ilvl="2">
+      <w:start w:val="1"/>
+      <w:numFmt w:val="decimal"/>
+      <w:lvlText w:val="%3."/>
+      <w:lvlJc w:val="left"/>
+      <w:pPr>
+        <w:tabs>
+          <w:tab w:val="num" w:pos="2160"/>
+        </w:tabs>
+        <w:ind w:left="2160" w:hanging="720"/>
+      </w:pPr>
+    </w:lvl>
+    <w:lvl w:ilvl="3">
+      <w:start w:val="1"/>
+      <w:numFmt w:val="decimal"/>
+      <w:lvlText w:val="%4."/>
+      <w:lvlJc w:val="left"/>
+      <w:pPr>
+        <w:tabs>
+          <w:tab w:val="num" w:pos="2880"/>
+        </w:tabs>
+        <w:ind w:left="2880" w:hanging="720"/>
+      </w:pPr>
+    </w:lvl>
+    <w:lvl w:ilvl="4">
+      <w:start w:val="1"/>
+      <w:numFmt w:val="decimal"/>
+      <w:lvlText w:val="%5."/>
+      <w:lvlJc w:val="left"/>
+      <w:pPr>
+        <w:tabs>
+          <w:tab w:val="num" w:pos="3600"/>
+        </w:tabs>
+        <w:ind w:left="3600" w:hanging="720"/>
+      </w:pPr>
+    </w:lvl>
+    <w:lvl w:ilvl="5">
+      <w:start w:val="1"/>
+      <w:numFmt w:val="decimal"/>
+      <w:lvlText w:val="%6."/>
+      <w:lvlJc w:val="left"/>
+      <w:pPr>
+        <w:tabs>
+          <w:tab w:val="num" w:pos="4320"/>
+        </w:tabs>
+        <w:ind w:left="4320" w:hanging="720"/>
+      </w:pPr>
+    </w:lvl>
+    <w:lvl w:ilvl="6">
+      <w:start w:val="1"/>
+      <w:numFmt w:val="decimal"/>
+      <w:lvlText w:val="%7."/>
+      <w:lvlJc w:val="left"/>
+      <w:pPr>
+        <w:tabs>
+          <w:tab w:val="num" w:pos="5040"/>
+        </w:tabs>
+        <w:ind w:left="5040" w:hanging="720"/>
+      </w:pPr>
+    </w:lvl>
+    <w:lvl w:ilvl="7">
+      <w:start w:val="1"/>
+      <w:numFmt w:val="decimal"/>
+      <w:lvlText w:val="%8."/>
+      <w:lvlJc w:val="left"/>
+      <w:pPr>
+        <w:tabs>
+          <w:tab w:val="num" w:pos="5760"/>
+        </w:tabs>
+        <w:ind w:left="5760" w:hanging="720"/>
+      </w:pPr>
+    </w:lvl>
+    <w:lvl w:ilvl="8">
+      <w:start w:val="1"/>
+      <w:numFmt w:val="decimal"/>
+      <w:lvlText w:val="%9."/>
+      <w:lvlJc w:val="left"/>
+      <w:pPr>
+        <w:tabs>
+          <w:tab w:val="num" w:pos="6480"/>
+        </w:tabs>
+        <w:ind w:left="6480" w:hanging="720"/>
+      </w:pPr>
+    </w:lvl>
+  </w:abstractNum>
+  <w:abstractNum w:abstractNumId="1" w15:restartNumberingAfterBreak="0">
+    <w:nsid w:val="01815AD2"/>
+    <w:multiLevelType w:val="multilevel"/>
+    <w:tmpl w:val="CE24CB76"/>
+    <w:lvl w:ilvl="0">
+      <w:start w:val="1"/>
+      <w:numFmt w:val="decimal"/>
+      <w:lvlText w:val="%1."/>
+      <w:lvlJc w:val="left"/>
+      <w:pPr>
+        <w:tabs>
+          <w:tab w:val="num" w:pos="720"/>
+        </w:tabs>
+        <w:ind w:left="720" w:hanging="720"/>
+      </w:pPr>
+    </w:lvl>
+    <w:lvl w:ilvl="1">
+      <w:start w:val="1"/>
+      <w:numFmt w:val="decimal"/>
+      <w:lvlText w:val="%2."/>
+      <w:lvlJc w:val="left"/>
+      <w:pPr>
+        <w:tabs>
+          <w:tab w:val="num" w:pos="1440"/>
+        </w:tabs>
+        <w:ind w:left="1440" w:hanging="720"/>
+      </w:pPr>
+    </w:lvl>
+    <w:lvl w:ilvl="2">
+      <w:start w:val="1"/>
+      <w:numFmt w:val="decimal"/>
+      <w:lvlText w:val="%3."/>
+      <w:lvlJc w:val="left"/>
+      <w:pPr>
+        <w:tabs>
+          <w:tab w:val="num" w:pos="2160"/>
+        </w:tabs>
+        <w:ind w:left="2160" w:hanging="720"/>
+      </w:pPr>
+    </w:lvl>
+    <w:lvl w:ilvl="3">
+      <w:start w:val="1"/>
+      <w:numFmt w:val="decimal"/>
+      <w:lvlText w:val="%4."/>
+      <w:lvlJc w:val="left"/>
+      <w:pPr>
+        <w:tabs>
+          <w:tab w:val="num" w:pos="2880"/>
+        </w:tabs>
+        <w:ind w:left="2880" w:hanging="720"/>
+      </w:pPr>
+    </w:lvl>
+    <w:lvl w:ilvl="4">
+      <w:start w:val="1"/>
+      <w:numFmt w:val="decimal"/>
+      <w:lvlText w:val="%5."/>
+      <w:lvlJc w:val="left"/>
+      <w:pPr>
+        <w:tabs>
+          <w:tab w:val="num" w:pos="3600"/>
+        </w:tabs>
+        <w:ind w:left="3600" w:hanging="720"/>
+      </w:pPr>
+    </w:lvl>
+    <w:lvl w:ilvl="5">
+      <w:start w:val="1"/>
+      <w:numFmt w:val="decimal"/>
+      <w:lvlText w:val="%6."/>
+      <w:lvlJc w:val="left"/>
+      <w:pPr>
+        <w:tabs>
+          <w:tab w:val="num" w:pos="4320"/>
+        </w:tabs>
+        <w:ind w:left="4320" w:hanging="720"/>
+      </w:pPr>
+    </w:lvl>
+    <w:lvl w:ilvl="6">
+      <w:start w:val="1"/>
+      <w:numFmt w:val="decimal"/>
+      <w:lvlText w:val="%7."/>
+      <w:lvlJc w:val="left"/>
+      <w:pPr>
+        <w:tabs>
+          <w:tab w:val="num" w:pos="5040"/>
+        </w:tabs>
+        <w:ind w:left="5040" w:hanging="720"/>
+      </w:pPr>
+    </w:lvl>
+    <w:lvl w:ilvl="7">
+      <w:start w:val="1"/>
+      <w:numFmt w:val="decimal"/>
+      <w:lvlText w:val="%8."/>
+      <w:lvlJc w:val="left"/>
+      <w:pPr>
+        <w:tabs>
+          <w:tab w:val="num" w:pos="5760"/>
+        </w:tabs>
+        <w:ind w:left="5760" w:hanging="720"/>
+      </w:pPr>
+    </w:lvl>
+    <w:lvl w:ilvl="8">
+      <w:start w:val="1"/>
+      <w:numFmt w:val="decimal"/>
+      <w:lvlText w:val="%9."/>
+      <w:lvlJc w:val="left"/>
+      <w:pPr>
+        <w:tabs>
+          <w:tab w:val="num" w:pos="6480"/>
+        </w:tabs>
+        <w:ind w:left="6480" w:hanging="720"/>
+      </w:pPr>
+    </w:lvl>
+  </w:abstractNum>
+  <w:abstractNum w:abstractNumId="2" w15:restartNumberingAfterBreak="0">
+    <w:nsid w:val="08CF19C2"/>
+    <w:multiLevelType w:val="multilevel"/>
+    <w:tmpl w:val="CE52B04E"/>
+    <w:lvl w:ilvl="0">
+      <w:start w:val="1"/>
+      <w:numFmt w:val="bullet"/>
+      <w:lvlText w:val=""/>
+      <w:lvlJc w:val="left"/>
+      <w:pPr>
+        <w:tabs>
+          <w:tab w:val="num" w:pos="720"/>
+        </w:tabs>
+        <w:ind w:left="720" w:hanging="360"/>
+      </w:pPr>
+      <w:rPr>
+        <w:rFonts w:ascii="Symbol" w:hAnsi="Symbol" w:hint="default"/>
+        <w:sz w:val="20"/>
+      </w:rPr>
+    </w:lvl>
+    <w:lvl w:ilvl="1" w:tentative="1">
+      <w:start w:val="1"/>
+      <w:numFmt w:val="bullet"/>
+      <w:lvlText w:val=""/>
+      <w:lvlJc w:val="left"/>
+      <w:pPr>
+        <w:tabs>
+          <w:tab w:val="num" w:pos="1440"/>
+        </w:tabs>
+        <w:ind w:left="1440" w:hanging="360"/>
+      </w:pPr>
+      <w:rPr>
+        <w:rFonts w:ascii="Symbol" w:hAnsi="Symbol" w:hint="default"/>
+        <w:sz w:val="20"/>
+      </w:rPr>
+    </w:lvl>
+    <w:lvl w:ilvl="2" w:tentative="1">
+      <w:start w:val="1"/>
+      <w:numFmt w:val="bullet"/>
+      <w:lvlText w:val=""/>
+      <w:lvlJc w:val="left"/>
+      <w:pPr>
+        <w:tabs>
+          <w:tab w:val="num" w:pos="2160"/>
+        </w:tabs>
+        <w:ind w:left="2160" w:hanging="360"/>
+      </w:pPr>
+      <w:rPr>
+        <w:rFonts w:ascii="Symbol" w:hAnsi="Symbol" w:hint="default"/>
+        <w:sz w:val="20"/>
+      </w:rPr>
+    </w:lvl>
+    <w:lvl w:ilvl="3" w:tentative="1">
+      <w:start w:val="1"/>
+      <w:numFmt w:val="bullet"/>
+      <w:lvlText w:val=""/>
+      <w:lvlJc w:val="left"/>
+      <w:pPr>
+        <w:tabs>
+          <w:tab w:val="num" w:pos="2880"/>
+        </w:tabs>
+        <w:ind w:left="2880" w:hanging="360"/>
+      </w:pPr>
+      <w:rPr>
+        <w:rFonts w:ascii="Symbol" w:hAnsi="Symbol" w:hint="default"/>
+        <w:sz w:val="20"/>
+      </w:rPr>
+    </w:lvl>
+    <w:lvl w:ilvl="4" w:tentative="1">
+      <w:start w:val="1"/>
+      <w:numFmt w:val="bullet"/>
+      <w:lvlText w:val=""/>
+      <w:lvlJc w:val="left"/>
+      <w:pPr>
+        <w:tabs>
+          <w:tab w:val="num" w:pos="3600"/>
+        </w:tabs>
+        <w:ind w:left="3600" w:hanging="360"/>
+      </w:pPr>
+      <w:rPr>
+        <w:rFonts w:ascii="Symbol" w:hAnsi="Symbol" w:hint="default"/>
+        <w:sz w:val="20"/>
+      </w:rPr>
+    </w:lvl>
+    <w:lvl w:ilvl="5" w:tentative="1">
+      <w:start w:val="1"/>
+      <w:numFmt w:val="bullet"/>
+      <w:lvlText w:val=""/>
+      <w:lvlJc w:val="left"/>
+      <w:pPr>
+        <w:tabs>
+          <w:tab w:val="num" w:pos="4320"/>
+        </w:tabs>
+        <w:ind w:left="4320" w:hanging="360"/>
+      </w:pPr>
+      <w:rPr>
+        <w:rFonts w:ascii="Symbol" w:hAnsi="Symbol" w:hint="default"/>
+        <w:sz w:val="20"/>
+      </w:rPr>
+    </w:lvl>
+    <w:lvl w:ilvl="6" w:tentative="1">
+      <w:start w:val="1"/>
+      <w:numFmt w:val="bullet"/>
+      <w:lvlText w:val=""/>
+      <w:lvlJc w:val="left"/>
+      <w:pPr>
+        <w:tabs>
+          <w:tab w:val="num" w:pos="5040"/>
+        </w:tabs>
+        <w:ind w:left="5040" w:hanging="360"/>
+      </w:pPr>
+      <w:rPr>
+        <w:rFonts w:ascii="Symbol" w:hAnsi="Symbol" w:hint="default"/>
+        <w:sz w:val="20"/>
+      </w:rPr>
+    </w:lvl>
+    <w:lvl w:ilvl="7" w:tentative="1">
+      <w:start w:val="1"/>
+      <w:numFmt w:val="bullet"/>
+      <w:lvlText w:val=""/>
+      <w:lvlJc w:val="left"/>
+      <w:pPr>
+        <w:tabs>
+          <w:tab w:val="num" w:pos="5760"/>
+        </w:tabs>
+        <w:ind w:left="5760" w:hanging="360"/>
+      </w:pPr>
+      <w:rPr>
+        <w:rFonts w:ascii="Symbol" w:hAnsi="Symbol" w:hint="default"/>
+        <w:sz w:val="20"/>
+      </w:rPr>
+    </w:lvl>
+    <w:lvl w:ilvl="8" w:tentative="1">
+      <w:start w:val="1"/>
+      <w:numFmt w:val="bullet"/>
+      <w:lvlText w:val=""/>
+      <w:lvlJc w:val="left"/>
+      <w:pPr>
+        <w:tabs>
+          <w:tab w:val="num" w:pos="6480"/>
+        </w:tabs>
+        <w:ind w:left="6480" w:hanging="360"/>
+      </w:pPr>
+      <w:rPr>
+        <w:rFonts w:ascii="Symbol" w:hAnsi="Symbol" w:hint="default"/>
+        <w:sz w:val="20"/>
+      </w:rPr>
+    </w:lvl>
+  </w:abstractNum>
+  <w:abstractNum w:abstractNumId="3" w15:restartNumberingAfterBreak="0">
+    <w:nsid w:val="0FAD1EF0"/>
+    <w:multiLevelType w:val="multilevel"/>
+    <w:tmpl w:val="4A7A8B08"/>
+    <w:lvl w:ilvl="0">
+      <w:start w:val="1"/>
+      <w:numFmt w:val="decimal"/>
+      <w:lvlText w:val="%1."/>
+      <w:lvlJc w:val="left"/>
+      <w:pPr>
+        <w:tabs>
+          <w:tab w:val="num" w:pos="720"/>
+        </w:tabs>
+        <w:ind w:left="720" w:hanging="720"/>
+      </w:pPr>
+    </w:lvl>
+    <w:lvl w:ilvl="1">
+      <w:start w:val="1"/>
+      <w:numFmt w:val="decimal"/>
+      <w:lvlText w:val="%2."/>
+      <w:lvlJc w:val="left"/>
+      <w:pPr>
+        <w:tabs>
+          <w:tab w:val="num" w:pos="1440"/>
+        </w:tabs>
+        <w:ind w:left="1440" w:hanging="720"/>
+      </w:pPr>
+    </w:lvl>
+    <w:lvl w:ilvl="2">
+      <w:start w:val="1"/>
+      <w:numFmt w:val="decimal"/>
+      <w:lvlText w:val="%3."/>
+      <w:lvlJc w:val="left"/>
+      <w:pPr>
+        <w:tabs>
+          <w:tab w:val="num" w:pos="2160"/>
+        </w:tabs>
+        <w:ind w:left="2160" w:hanging="720"/>
+      </w:pPr>
+    </w:lvl>
+    <w:lvl w:ilvl="3">
+      <w:start w:val="1"/>
+      <w:numFmt w:val="decimal"/>
+      <w:lvlText w:val="%4."/>
+      <w:lvlJc w:val="left"/>
+      <w:pPr>
+        <w:tabs>
+          <w:tab w:val="num" w:pos="2880"/>
+        </w:tabs>
+        <w:ind w:left="2880" w:hanging="720"/>
+      </w:pPr>
+    </w:lvl>
+    <w:lvl w:ilvl="4">
+      <w:start w:val="1"/>
+      <w:numFmt w:val="decimal"/>
+      <w:lvlText w:val="%5."/>
+      <w:lvlJc w:val="left"/>
+      <w:pPr>
+        <w:tabs>
+          <w:tab w:val="num" w:pos="3600"/>
+        </w:tabs>
+        <w:ind w:left="3600" w:hanging="720"/>
+      </w:pPr>
+    </w:lvl>
+    <w:lvl w:ilvl="5">
+      <w:start w:val="1"/>
+      <w:numFmt w:val="decimal"/>
+      <w:lvlText w:val="%6."/>
+      <w:lvlJc w:val="left"/>
+      <w:pPr>
+        <w:tabs>
+          <w:tab w:val="num" w:pos="4320"/>
+        </w:tabs>
+        <w:ind w:left="4320" w:hanging="720"/>
+      </w:pPr>
+    </w:lvl>
+    <w:lvl w:ilvl="6">
+      <w:start w:val="1"/>
+      <w:numFmt w:val="decimal"/>
+      <w:lvlText w:val="%7."/>
+      <w:lvlJc w:val="left"/>
+      <w:pPr>
+        <w:tabs>
+          <w:tab w:val="num" w:pos="5040"/>
+        </w:tabs>
+        <w:ind w:left="5040" w:hanging="720"/>
+      </w:pPr>
+    </w:lvl>
+    <w:lvl w:ilvl="7">
+      <w:start w:val="1"/>
+      <w:numFmt w:val="decimal"/>
+      <w:lvlText w:val="%8."/>
+      <w:lvlJc w:val="left"/>
+      <w:pPr>
+        <w:tabs>
+          <w:tab w:val="num" w:pos="5760"/>
+        </w:tabs>
+        <w:ind w:left="5760" w:hanging="720"/>
+      </w:pPr>
+    </w:lvl>
+    <w:lvl w:ilvl="8">
+      <w:start w:val="1"/>
+      <w:numFmt w:val="decimal"/>
+      <w:lvlText w:val="%9."/>
+      <w:lvlJc w:val="left"/>
+      <w:pPr>
+        <w:tabs>
+          <w:tab w:val="num" w:pos="6480"/>
+        </w:tabs>
+        <w:ind w:left="6480" w:hanging="720"/>
+      </w:pPr>
+    </w:lvl>
+  </w:abstractNum>
+  <w:abstractNum w:abstractNumId="4" w15:restartNumberingAfterBreak="0">
+    <w:nsid w:val="14B47409"/>
+    <w:multiLevelType w:val="multilevel"/>
+    <w:tmpl w:val="7C1CA302"/>
+    <w:lvl w:ilvl="0">
+      <w:start w:val="1"/>
+      <w:numFmt w:val="bullet"/>
+      <w:lvlText w:val=""/>
+      <w:lvlJc w:val="left"/>
+      <w:pPr>
+        <w:tabs>
+          <w:tab w:val="num" w:pos="720"/>
+        </w:tabs>
+        <w:ind w:left="720" w:hanging="360"/>
+      </w:pPr>
+      <w:rPr>
+        <w:rFonts w:ascii="Symbol" w:hAnsi="Symbol" w:hint="default"/>
+        <w:sz w:val="20"/>
+      </w:rPr>
+    </w:lvl>
+    <w:lvl w:ilvl="1" w:tentative="1">
+      <w:start w:val="1"/>
+      <w:numFmt w:val="bullet"/>
+      <w:lvlText w:val=""/>
+      <w:lvlJc w:val="left"/>
+      <w:pPr>
+        <w:tabs>
+          <w:tab w:val="num" w:pos="1440"/>
+        </w:tabs>
+        <w:ind w:left="1440" w:hanging="360"/>
+      </w:pPr>
+      <w:rPr>
+        <w:rFonts w:ascii="Symbol" w:hAnsi="Symbol" w:hint="default"/>
+        <w:sz w:val="20"/>
+      </w:rPr>
+    </w:lvl>
+    <w:lvl w:ilvl="2" w:tentative="1">
+      <w:start w:val="1"/>
+      <w:numFmt w:val="bullet"/>
+      <w:lvlText w:val=""/>
+      <w:lvlJc w:val="left"/>
+      <w:pPr>
+        <w:tabs>
+          <w:tab w:val="num" w:pos="2160"/>
+        </w:tabs>
+        <w:ind w:left="2160" w:hanging="360"/>
+      </w:pPr>
+      <w:rPr>
+        <w:rFonts w:ascii="Symbol" w:hAnsi="Symbol" w:hint="default"/>
+        <w:sz w:val="20"/>
+      </w:rPr>
+    </w:lvl>
+    <w:lvl w:ilvl="3" w:tentative="1">
+      <w:start w:val="1"/>
+      <w:numFmt w:val="bullet"/>
+      <w:lvlText w:val=""/>
+      <w:lvlJc w:val="left"/>
+      <w:pPr>
+        <w:tabs>
+          <w:tab w:val="num" w:pos="2880"/>
+        </w:tabs>
+        <w:ind w:left="2880" w:hanging="360"/>
+      </w:pPr>
+      <w:rPr>
+        <w:rFonts w:ascii="Symbol" w:hAnsi="Symbol" w:hint="default"/>
+        <w:sz w:val="20"/>
+      </w:rPr>
+    </w:lvl>
+    <w:lvl w:ilvl="4" w:tentative="1">
+      <w:start w:val="1"/>
+      <w:numFmt w:val="bullet"/>
+      <w:lvlText w:val=""/>
+      <w:lvlJc w:val="left"/>
+      <w:pPr>
+        <w:tabs>
+          <w:tab w:val="num" w:pos="3600"/>
+        </w:tabs>
+        <w:ind w:left="3600" w:hanging="360"/>
+      </w:pPr>
+      <w:rPr>
+        <w:rFonts w:ascii="Symbol" w:hAnsi="Symbol" w:hint="default"/>
+        <w:sz w:val="20"/>
+      </w:rPr>
+    </w:lvl>
+    <w:lvl w:ilvl="5" w:tentative="1">
+      <w:start w:val="1"/>
+      <w:numFmt w:val="bullet"/>
+      <w:lvlText w:val=""/>
+      <w:lvlJc w:val="left"/>
+      <w:pPr>
+        <w:tabs>
+          <w:tab w:val="num" w:pos="4320"/>
+        </w:tabs>
+        <w:ind w:left="4320" w:hanging="360"/>
+      </w:pPr>
+      <w:rPr>
+        <w:rFonts w:ascii="Symbol" w:hAnsi="Symbol" w:hint="default"/>
+        <w:sz w:val="20"/>
+      </w:rPr>
+    </w:lvl>
+    <w:lvl w:ilvl="6" w:tentative="1">
+      <w:start w:val="1"/>
+      <w:numFmt w:val="bullet"/>
+      <w:lvlText w:val=""/>
+      <w:lvlJc w:val="left"/>
+      <w:pPr>
+        <w:tabs>
+          <w:tab w:val="num" w:pos="5040"/>
+        </w:tabs>
+        <w:ind w:left="5040" w:hanging="360"/>
+      </w:pPr>
+      <w:rPr>
+        <w:rFonts w:ascii="Symbol" w:hAnsi="Symbol" w:hint="default"/>
+        <w:sz w:val="20"/>
+      </w:rPr>
+    </w:lvl>
+    <w:lvl w:ilvl="7" w:tentative="1">
+      <w:start w:val="1"/>
+      <w:numFmt w:val="bullet"/>
+      <w:lvlText w:val=""/>
+      <w:lvlJc w:val="left"/>
+      <w:pPr>
+        <w:tabs>
+          <w:tab w:val="num" w:pos="5760"/>
+        </w:tabs>
+        <w:ind w:left="5760" w:hanging="360"/>
+      </w:pPr>
+      <w:rPr>
+        <w:rFonts w:ascii="Symbol" w:hAnsi="Symbol" w:hint="default"/>
+        <w:sz w:val="20"/>
+      </w:rPr>
+    </w:lvl>
+    <w:lvl w:ilvl="8" w:tentative="1">
+      <w:start w:val="1"/>
+      <w:numFmt w:val="bullet"/>
+      <w:lvlText w:val=""/>
+      <w:lvlJc w:val="left"/>
+      <w:pPr>
+        <w:tabs>
+          <w:tab w:val="num" w:pos="6480"/>
+        </w:tabs>
+        <w:ind w:left="6480" w:hanging="360"/>
+      </w:pPr>
+      <w:rPr>
+        <w:rFonts w:ascii="Symbol" w:hAnsi="Symbol" w:hint="default"/>
+        <w:sz w:val="20"/>
+      </w:rPr>
+    </w:lvl>
+  </w:abstractNum>
+  <w:abstractNum w:abstractNumId="5" w15:restartNumberingAfterBreak="0">
+    <w:nsid w:val="2A053A57"/>
+    <w:multiLevelType w:val="multilevel"/>
+    <w:tmpl w:val="BC20C6F2"/>
+    <w:lvl w:ilvl="0">
+      <w:start w:val="1"/>
+      <w:numFmt w:val="bullet"/>
+      <w:lvlText w:val=""/>
+      <w:lvlJc w:val="left"/>
+      <w:pPr>
+        <w:tabs>
+          <w:tab w:val="num" w:pos="720"/>
+        </w:tabs>
+        <w:ind w:left="720" w:hanging="360"/>
+      </w:pPr>
+      <w:rPr>
+        <w:rFonts w:ascii="Symbol" w:hAnsi="Symbol" w:hint="default"/>
+        <w:sz w:val="20"/>
+      </w:rPr>
+    </w:lvl>
+    <w:lvl w:ilvl="1" w:tentative="1">
+      <w:start w:val="1"/>
+      <w:numFmt w:val="bullet"/>
+      <w:lvlText w:val=""/>
+      <w:lvlJc w:val="left"/>
+      <w:pPr>
+        <w:tabs>
+          <w:tab w:val="num" w:pos="1440"/>
+        </w:tabs>
+        <w:ind w:left="1440" w:hanging="360"/>
+      </w:pPr>
+      <w:rPr>
+        <w:rFonts w:ascii="Symbol" w:hAnsi="Symbol" w:hint="default"/>
+        <w:sz w:val="20"/>
+      </w:rPr>
+    </w:lvl>
+    <w:lvl w:ilvl="2" w:tentative="1">
+      <w:start w:val="1"/>
+      <w:numFmt w:val="bullet"/>
+      <w:lvlText w:val=""/>
+      <w:lvlJc w:val="left"/>
+      <w:pPr>
+        <w:tabs>
+          <w:tab w:val="num" w:pos="2160"/>
+        </w:tabs>
+        <w:ind w:left="2160" w:hanging="360"/>
+      </w:pPr>
+      <w:rPr>
+        <w:rFonts w:ascii="Symbol" w:hAnsi="Symbol" w:hint="default"/>
+        <w:sz w:val="20"/>
+      </w:rPr>
+    </w:lvl>
+    <w:lvl w:ilvl="3" w:tentative="1">
+      <w:start w:val="1"/>
+      <w:numFmt w:val="bullet"/>
+      <w:lvlText w:val=""/>
+      <w:lvlJc w:val="left"/>
+      <w:pPr>
+        <w:tabs>
+          <w:tab w:val="num" w:pos="2880"/>
+        </w:tabs>
+        <w:ind w:left="2880" w:hanging="360"/>
+      </w:pPr>
+      <w:rPr>
+        <w:rFonts w:ascii="Symbol" w:hAnsi="Symbol" w:hint="default"/>
+        <w:sz w:val="20"/>
+      </w:rPr>
+    </w:lvl>
+    <w:lvl w:ilvl="4" w:tentative="1">
+      <w:start w:val="1"/>
+      <w:numFmt w:val="bullet"/>
+      <w:lvlText w:val=""/>
+      <w:lvlJc w:val="left"/>
+      <w:pPr>
+        <w:tabs>
+          <w:tab w:val="num" w:pos="3600"/>
+        </w:tabs>
+        <w:ind w:left="3600" w:hanging="360"/>
+      </w:pPr>
+      <w:rPr>
+        <w:rFonts w:ascii="Symbol" w:hAnsi="Symbol" w:hint="default"/>
+        <w:sz w:val="20"/>
+      </w:rPr>
+    </w:lvl>
+    <w:lvl w:ilvl="5" w:tentative="1">
+      <w:start w:val="1"/>
+      <w:numFmt w:val="bullet"/>
+      <w:lvlText w:val=""/>
+      <w:lvlJc w:val="left"/>
+      <w:pPr>
+        <w:tabs>
+          <w:tab w:val="num" w:pos="4320"/>
+        </w:tabs>
+        <w:ind w:left="4320" w:hanging="360"/>
+      </w:pPr>
+      <w:rPr>
+        <w:rFonts w:ascii="Symbol" w:hAnsi="Symbol" w:hint="default"/>
+        <w:sz w:val="20"/>
+      </w:rPr>
+    </w:lvl>
+    <w:lvl w:ilvl="6" w:tentative="1">
+      <w:start w:val="1"/>
+      <w:numFmt w:val="bullet"/>
+      <w:lvlText w:val=""/>
+      <w:lvlJc w:val="left"/>
+      <w:pPr>
+        <w:tabs>
+          <w:tab w:val="num" w:pos="5040"/>
+        </w:tabs>
+        <w:ind w:left="5040" w:hanging="360"/>
+      </w:pPr>
+      <w:rPr>
+        <w:rFonts w:ascii="Symbol" w:hAnsi="Symbol" w:hint="default"/>
+        <w:sz w:val="20"/>
+      </w:rPr>
+    </w:lvl>
+    <w:lvl w:ilvl="7" w:tentative="1">
+      <w:start w:val="1"/>
+      <w:numFmt w:val="bullet"/>
+      <w:lvlText w:val=""/>
+      <w:lvlJc w:val="left"/>
+      <w:pPr>
+        <w:tabs>
+          <w:tab w:val="num" w:pos="5760"/>
+        </w:tabs>
+        <w:ind w:left="5760" w:hanging="360"/>
+      </w:pPr>
+      <w:rPr>
+        <w:rFonts w:ascii="Symbol" w:hAnsi="Symbol" w:hint="default"/>
+        <w:sz w:val="20"/>
+      </w:rPr>
+    </w:lvl>
+    <w:lvl w:ilvl="8" w:tentative="1">
+      <w:start w:val="1"/>
+      <w:numFmt w:val="bullet"/>
+      <w:lvlText w:val=""/>
+      <w:lvlJc w:val="left"/>
+      <w:pPr>
+        <w:tabs>
+          <w:tab w:val="num" w:pos="6480"/>
+        </w:tabs>
+        <w:ind w:left="6480" w:hanging="360"/>
+      </w:pPr>
+      <w:rPr>
+        <w:rFonts w:ascii="Symbol" w:hAnsi="Symbol" w:hint="default"/>
+        <w:sz w:val="20"/>
+      </w:rPr>
+    </w:lvl>
+  </w:abstractNum>
+  <w:abstractNum w:abstractNumId="6" w15:restartNumberingAfterBreak="0">
+    <w:nsid w:val="30AE4D3D"/>
+    <w:multiLevelType w:val="multilevel"/>
+    <w:tmpl w:val="E222BD9E"/>
+    <w:lvl w:ilvl="0">
+      <w:start w:val="1"/>
+      <w:numFmt w:val="bullet"/>
+      <w:lvlText w:val=""/>
+      <w:lvlJc w:val="left"/>
+      <w:pPr>
+        <w:tabs>
+          <w:tab w:val="num" w:pos="720"/>
+        </w:tabs>
+        <w:ind w:left="720" w:hanging="360"/>
+      </w:pPr>
+      <w:rPr>
+        <w:rFonts w:ascii="Symbol" w:hAnsi="Symbol" w:hint="default"/>
+        <w:sz w:val="20"/>
+      </w:rPr>
+    </w:lvl>
+    <w:lvl w:ilvl="1" w:tentative="1">
+      <w:start w:val="1"/>
+      <w:numFmt w:val="bullet"/>
+      <w:lvlText w:val=""/>
+      <w:lvlJc w:val="left"/>
+      <w:pPr>
+        <w:tabs>
+          <w:tab w:val="num" w:pos="1440"/>
+        </w:tabs>
+        <w:ind w:left="1440" w:hanging="360"/>
+      </w:pPr>
+      <w:rPr>
+        <w:rFonts w:ascii="Symbol" w:hAnsi="Symbol" w:hint="default"/>
+        <w:sz w:val="20"/>
+      </w:rPr>
+    </w:lvl>
+    <w:lvl w:ilvl="2" w:tentative="1">
+      <w:start w:val="1"/>
+      <w:numFmt w:val="bullet"/>
+      <w:lvlText w:val=""/>
+      <w:lvlJc w:val="left"/>
+      <w:pPr>
+        <w:tabs>
+          <w:tab w:val="num" w:pos="2160"/>
+        </w:tabs>
+        <w:ind w:left="2160" w:hanging="360"/>
+      </w:pPr>
+      <w:rPr>
+        <w:rFonts w:ascii="Symbol" w:hAnsi="Symbol" w:hint="default"/>
+        <w:sz w:val="20"/>
+      </w:rPr>
+    </w:lvl>
+    <w:lvl w:ilvl="3" w:tentative="1">
+      <w:start w:val="1"/>
+      <w:numFmt w:val="bullet"/>
+      <w:lvlText w:val=""/>
+      <w:lvlJc w:val="left"/>
+      <w:pPr>
+        <w:tabs>
+          <w:tab w:val="num" w:pos="2880"/>
+        </w:tabs>
+        <w:ind w:left="2880" w:hanging="360"/>
+      </w:pPr>
+      <w:rPr>
+        <w:rFonts w:ascii="Symbol" w:hAnsi="Symbol" w:hint="default"/>
+        <w:sz w:val="20"/>
+      </w:rPr>
+    </w:lvl>
+    <w:lvl w:ilvl="4" w:tentative="1">
+      <w:start w:val="1"/>
+      <w:numFmt w:val="bullet"/>
+      <w:lvlText w:val=""/>
+      <w:lvlJc w:val="left"/>
+      <w:pPr>
+        <w:tabs>
+          <w:tab w:val="num" w:pos="3600"/>
+        </w:tabs>
+        <w:ind w:left="3600" w:hanging="360"/>
+      </w:pPr>
+      <w:rPr>
+        <w:rFonts w:ascii="Symbol" w:hAnsi="Symbol" w:hint="default"/>
+        <w:sz w:val="20"/>
+      </w:rPr>
+    </w:lvl>
+    <w:lvl w:ilvl="5" w:tentative="1">
+      <w:start w:val="1"/>
+      <w:numFmt w:val="bullet"/>
+      <w:lvlText w:val=""/>
+      <w:lvlJc w:val="left"/>
+      <w:pPr>
+        <w:tabs>
+          <w:tab w:val="num" w:pos="4320"/>
+        </w:tabs>
+        <w:ind w:left="4320" w:hanging="360"/>
+      </w:pPr>
+      <w:rPr>
+        <w:rFonts w:ascii="Symbol" w:hAnsi="Symbol" w:hint="default"/>
+        <w:sz w:val="20"/>
+      </w:rPr>
+    </w:lvl>
+    <w:lvl w:ilvl="6" w:tentative="1">
+      <w:start w:val="1"/>
+      <w:numFmt w:val="bullet"/>
+      <w:lvlText w:val=""/>
+      <w:lvlJc w:val="left"/>
+      <w:pPr>
+        <w:tabs>
+          <w:tab w:val="num" w:pos="5040"/>
+        </w:tabs>
+        <w:ind w:left="5040" w:hanging="360"/>
+      </w:pPr>
+      <w:rPr>
+        <w:rFonts w:ascii="Symbol" w:hAnsi="Symbol" w:hint="default"/>
+        <w:sz w:val="20"/>
+      </w:rPr>
+    </w:lvl>
+    <w:lvl w:ilvl="7" w:tentative="1">
+      <w:start w:val="1"/>
+      <w:numFmt w:val="bullet"/>
+      <w:lvlText w:val=""/>
+      <w:lvlJc w:val="left"/>
+      <w:pPr>
+        <w:tabs>
+          <w:tab w:val="num" w:pos="5760"/>
+        </w:tabs>
+        <w:ind w:left="5760" w:hanging="360"/>
+      </w:pPr>
+      <w:rPr>
+        <w:rFonts w:ascii="Symbol" w:hAnsi="Symbol" w:hint="default"/>
+        <w:sz w:val="20"/>
+      </w:rPr>
+    </w:lvl>
+    <w:lvl w:ilvl="8" w:tentative="1">
+      <w:start w:val="1"/>
+      <w:numFmt w:val="bullet"/>
+      <w:lvlText w:val=""/>
+      <w:lvlJc w:val="left"/>
+      <w:pPr>
+        <w:tabs>
+          <w:tab w:val="num" w:pos="6480"/>
+        </w:tabs>
+        <w:ind w:left="6480" w:hanging="360"/>
+      </w:pPr>
+      <w:rPr>
+        <w:rFonts w:ascii="Symbol" w:hAnsi="Symbol" w:hint="default"/>
+        <w:sz w:val="20"/>
+      </w:rPr>
+    </w:lvl>
+  </w:abstractNum>
+  <w:abstractNum w:abstractNumId="7" w15:restartNumberingAfterBreak="0">
+    <w:nsid w:val="39454B71"/>
+    <w:multiLevelType w:val="multilevel"/>
+    <w:tmpl w:val="C458D9B2"/>
+    <w:lvl w:ilvl="0">
+      <w:start w:val="1"/>
+      <w:numFmt w:val="bullet"/>
+      <w:lvlText w:val=""/>
+      <w:lvlJc w:val="left"/>
+      <w:pPr>
+        <w:tabs>
+          <w:tab w:val="num" w:pos="720"/>
+        </w:tabs>
+        <w:ind w:left="720" w:hanging="360"/>
+      </w:pPr>
+      <w:rPr>
+        <w:rFonts w:ascii="Symbol" w:hAnsi="Symbol" w:hint="default"/>
+        <w:sz w:val="20"/>
+      </w:rPr>
+    </w:lvl>
+    <w:lvl w:ilvl="1" w:tentative="1">
+      <w:start w:val="1"/>
+      <w:numFmt w:val="bullet"/>
+      <w:lvlText w:val=""/>
+      <w:lvlJc w:val="left"/>
+      <w:pPr>
+        <w:tabs>
+          <w:tab w:val="num" w:pos="1440"/>
+        </w:tabs>
+        <w:ind w:left="1440" w:hanging="360"/>
+      </w:pPr>
+      <w:rPr>
+        <w:rFonts w:ascii="Symbol" w:hAnsi="Symbol" w:hint="default"/>
+        <w:sz w:val="20"/>
+      </w:rPr>
+    </w:lvl>
+    <w:lvl w:ilvl="2" w:tentative="1">
+      <w:start w:val="1"/>
+      <w:numFmt w:val="bullet"/>
+      <w:lvlText w:val=""/>
+      <w:lvlJc w:val="left"/>
+      <w:pPr>
+        <w:tabs>
+          <w:tab w:val="num" w:pos="2160"/>
+        </w:tabs>
+        <w:ind w:left="2160" w:hanging="360"/>
+      </w:pPr>
+      <w:rPr>
+        <w:rFonts w:ascii="Symbol" w:hAnsi="Symbol" w:hint="default"/>
+        <w:sz w:val="20"/>
+      </w:rPr>
+    </w:lvl>
+    <w:lvl w:ilvl="3" w:tentative="1">
+      <w:start w:val="1"/>
+      <w:numFmt w:val="bullet"/>
+      <w:lvlText w:val=""/>
+      <w:lvlJc w:val="left"/>
+      <w:pPr>
+        <w:tabs>
+          <w:tab w:val="num" w:pos="2880"/>
+        </w:tabs>
+        <w:ind w:left="2880" w:hanging="360"/>
+      </w:pPr>
+      <w:rPr>
+        <w:rFonts w:ascii="Symbol" w:hAnsi="Symbol" w:hint="default"/>
+        <w:sz w:val="20"/>
+      </w:rPr>
+    </w:lvl>
+    <w:lvl w:ilvl="4" w:tentative="1">
+      <w:start w:val="1"/>
+      <w:numFmt w:val="bullet"/>
+      <w:lvlText w:val=""/>
+      <w:lvlJc w:val="left"/>
+      <w:pPr>
+        <w:tabs>
+          <w:tab w:val="num" w:pos="3600"/>
+        </w:tabs>
+        <w:ind w:left="3600" w:hanging="360"/>
+      </w:pPr>
+      <w:rPr>
+        <w:rFonts w:ascii="Symbol" w:hAnsi="Symbol" w:hint="default"/>
+        <w:sz w:val="20"/>
+      </w:rPr>
+    </w:lvl>
+    <w:lvl w:ilvl="5" w:tentative="1">
+      <w:start w:val="1"/>
+      <w:numFmt w:val="bullet"/>
+      <w:lvlText w:val=""/>
+      <w:lvlJc w:val="left"/>
+      <w:pPr>
+        <w:tabs>
+          <w:tab w:val="num" w:pos="4320"/>
+        </w:tabs>
+        <w:ind w:left="4320" w:hanging="360"/>
+      </w:pPr>
+      <w:rPr>
+        <w:rFonts w:ascii="Symbol" w:hAnsi="Symbol" w:hint="default"/>
+        <w:sz w:val="20"/>
+      </w:rPr>
+    </w:lvl>
+    <w:lvl w:ilvl="6" w:tentative="1">
+      <w:start w:val="1"/>
+      <w:numFmt w:val="bullet"/>
+      <w:lvlText w:val=""/>
+      <w:lvlJc w:val="left"/>
+      <w:pPr>
+        <w:tabs>
+          <w:tab w:val="num" w:pos="5040"/>
+        </w:tabs>
+        <w:ind w:left="5040" w:hanging="360"/>
+      </w:pPr>
+      <w:rPr>
+        <w:rFonts w:ascii="Symbol" w:hAnsi="Symbol" w:hint="default"/>
+        <w:sz w:val="20"/>
+      </w:rPr>
+    </w:lvl>
+    <w:lvl w:ilvl="7" w:tentative="1">
+      <w:start w:val="1"/>
+      <w:numFmt w:val="bullet"/>
+      <w:lvlText w:val=""/>
+      <w:lvlJc w:val="left"/>
+      <w:pPr>
+        <w:tabs>
+          <w:tab w:val="num" w:pos="5760"/>
+        </w:tabs>
+        <w:ind w:left="5760" w:hanging="360"/>
+      </w:pPr>
+      <w:rPr>
+        <w:rFonts w:ascii="Symbol" w:hAnsi="Symbol" w:hint="default"/>
+        <w:sz w:val="20"/>
+      </w:rPr>
+    </w:lvl>
+    <w:lvl w:ilvl="8" w:tentative="1">
+      <w:start w:val="1"/>
+      <w:numFmt w:val="bullet"/>
+      <w:lvlText w:val=""/>
+      <w:lvlJc w:val="left"/>
+      <w:pPr>
+        <w:tabs>
+          <w:tab w:val="num" w:pos="6480"/>
+        </w:tabs>
+        <w:ind w:left="6480" w:hanging="360"/>
+      </w:pPr>
+      <w:rPr>
+        <w:rFonts w:ascii="Symbol" w:hAnsi="Symbol" w:hint="default"/>
+        <w:sz w:val="20"/>
+      </w:rPr>
+    </w:lvl>
+  </w:abstractNum>
+  <w:abstractNum w:abstractNumId="8" w15:restartNumberingAfterBreak="0">
+    <w:nsid w:val="44925D26"/>
+    <w:multiLevelType w:val="multilevel"/>
+    <w:tmpl w:val="82A6A10A"/>
+    <w:lvl w:ilvl="0">
+      <w:start w:val="1"/>
+      <w:numFmt w:val="decimal"/>
+      <w:lvlText w:val="%1."/>
+      <w:lvlJc w:val="left"/>
+      <w:pPr>
+        <w:tabs>
+          <w:tab w:val="num" w:pos="720"/>
+        </w:tabs>
+        <w:ind w:left="720" w:hanging="720"/>
+      </w:pPr>
+    </w:lvl>
+    <w:lvl w:ilvl="1">
+      <w:start w:val="1"/>
+      <w:numFmt w:val="decimal"/>
+      <w:lvlText w:val="%2."/>
+      <w:lvlJc w:val="left"/>
+      <w:pPr>
+        <w:tabs>
+          <w:tab w:val="num" w:pos="1440"/>
+        </w:tabs>
+        <w:ind w:left="1440" w:hanging="720"/>
+      </w:pPr>
+    </w:lvl>
+    <w:lvl w:ilvl="2">
+      <w:start w:val="1"/>
+      <w:numFmt w:val="decimal"/>
+      <w:lvlText w:val="%3."/>
+      <w:lvlJc w:val="left"/>
+      <w:pPr>
+        <w:tabs>
+          <w:tab w:val="num" w:pos="2160"/>
+        </w:tabs>
+        <w:ind w:left="2160" w:hanging="720"/>
+      </w:pPr>
+    </w:lvl>
+    <w:lvl w:ilvl="3">
+      <w:start w:val="1"/>
+      <w:numFmt w:val="decimal"/>
+      <w:lvlText w:val="%4."/>
+      <w:lvlJc w:val="left"/>
+      <w:pPr>
+        <w:tabs>
+          <w:tab w:val="num" w:pos="2880"/>
+        </w:tabs>
+        <w:ind w:left="2880" w:hanging="720"/>
+      </w:pPr>
+    </w:lvl>
+    <w:lvl w:ilvl="4">
+      <w:start w:val="1"/>
+      <w:numFmt w:val="decimal"/>
+      <w:lvlText w:val="%5."/>
+      <w:lvlJc w:val="left"/>
+      <w:pPr>
+        <w:tabs>
+          <w:tab w:val="num" w:pos="3600"/>
+        </w:tabs>
+        <w:ind w:left="3600" w:hanging="720"/>
+      </w:pPr>
+    </w:lvl>
+    <w:lvl w:ilvl="5">
+      <w:start w:val="1"/>
+      <w:numFmt w:val="decimal"/>
+      <w:lvlText w:val="%6."/>
+      <w:lvlJc w:val="left"/>
+      <w:pPr>
+        <w:tabs>
+          <w:tab w:val="num" w:pos="4320"/>
+        </w:tabs>
+        <w:ind w:left="4320" w:hanging="720"/>
+      </w:pPr>
+    </w:lvl>
+    <w:lvl w:ilvl="6">
+      <w:start w:val="1"/>
+      <w:numFmt w:val="decimal"/>
+      <w:lvlText w:val="%7."/>
+      <w:lvlJc w:val="left"/>
+      <w:pPr>
+        <w:tabs>
+          <w:tab w:val="num" w:pos="5040"/>
+        </w:tabs>
+        <w:ind w:left="5040" w:hanging="720"/>
+      </w:pPr>
+    </w:lvl>
+    <w:lvl w:ilvl="7">
+      <w:start w:val="1"/>
+      <w:numFmt w:val="decimal"/>
+      <w:lvlText w:val="%8."/>
+      <w:lvlJc w:val="left"/>
+      <w:pPr>
+        <w:tabs>
+          <w:tab w:val="num" w:pos="5760"/>
+        </w:tabs>
+        <w:ind w:left="5760" w:hanging="720"/>
+      </w:pPr>
+    </w:lvl>
+    <w:lvl w:ilvl="8">
+      <w:start w:val="1"/>
+      <w:numFmt w:val="decimal"/>
+      <w:lvlText w:val="%9."/>
+      <w:lvlJc w:val="left"/>
+      <w:pPr>
+        <w:tabs>
+          <w:tab w:val="num" w:pos="6480"/>
+        </w:tabs>
+        <w:ind w:left="6480" w:hanging="720"/>
+      </w:pPr>
+    </w:lvl>
+  </w:abstractNum>
+  <w:abstractNum w:abstractNumId="9" w15:restartNumberingAfterBreak="0">
+    <w:nsid w:val="48AA58F3"/>
+    <w:multiLevelType w:val="multilevel"/>
+    <w:tmpl w:val="B5C4B712"/>
+    <w:lvl w:ilvl="0">
+      <w:start w:val="1"/>
+      <w:numFmt w:val="bullet"/>
+      <w:lvlText w:val=""/>
+      <w:lvlJc w:val="left"/>
+      <w:pPr>
+        <w:tabs>
+          <w:tab w:val="num" w:pos="720"/>
+        </w:tabs>
+        <w:ind w:left="720" w:hanging="720"/>
+      </w:pPr>
+      <w:rPr>
+        <w:rFonts w:ascii="Symbol" w:hAnsi="Symbol" w:hint="default"/>
+      </w:rPr>
+    </w:lvl>
+    <w:lvl w:ilvl="1">
+      <w:start w:val="1"/>
+      <w:numFmt w:val="decimal"/>
+      <w:lvlText w:val="%2."/>
+      <w:lvlJc w:val="left"/>
+      <w:pPr>
+        <w:tabs>
+          <w:tab w:val="num" w:pos="1440"/>
+        </w:tabs>
+        <w:ind w:left="1440" w:hanging="720"/>
+      </w:pPr>
+    </w:lvl>
+    <w:lvl w:ilvl="2">
+      <w:start w:val="1"/>
+      <w:numFmt w:val="decimal"/>
+      <w:lvlText w:val="%3."/>
+      <w:lvlJc w:val="left"/>
+      <w:pPr>
+        <w:tabs>
+          <w:tab w:val="num" w:pos="2160"/>
+        </w:tabs>
+        <w:ind w:left="2160" w:hanging="720"/>
+      </w:pPr>
+    </w:lvl>
+    <w:lvl w:ilvl="3">
+      <w:start w:val="1"/>
+      <w:numFmt w:val="decimal"/>
+      <w:lvlText w:val="%4."/>
+      <w:lvlJc w:val="left"/>
+      <w:pPr>
+        <w:tabs>
+          <w:tab w:val="num" w:pos="2880"/>
+        </w:tabs>
+        <w:ind w:left="2880" w:hanging="720"/>
+      </w:pPr>
+    </w:lvl>
+    <w:lvl w:ilvl="4">
+      <w:start w:val="1"/>
+      <w:numFmt w:val="decimal"/>
+      <w:lvlText w:val="%5."/>
+      <w:lvlJc w:val="left"/>
+      <w:pPr>
+        <w:tabs>
+          <w:tab w:val="num" w:pos="3600"/>
+        </w:tabs>
+        <w:ind w:left="3600" w:hanging="720"/>
+      </w:pPr>
+    </w:lvl>
+    <w:lvl w:ilvl="5">
+      <w:start w:val="1"/>
+      <w:numFmt w:val="decimal"/>
+      <w:lvlText w:val="%6."/>
+      <w:lvlJc w:val="left"/>
+      <w:pPr>
+        <w:tabs>
+          <w:tab w:val="num" w:pos="4320"/>
+        </w:tabs>
+        <w:ind w:left="4320" w:hanging="720"/>
+      </w:pPr>
+    </w:lvl>
+    <w:lvl w:ilvl="6">
+      <w:start w:val="1"/>
+      <w:numFmt w:val="decimal"/>
+      <w:lvlText w:val="%7."/>
+      <w:lvlJc w:val="left"/>
+      <w:pPr>
+        <w:tabs>
+          <w:tab w:val="num" w:pos="5040"/>
+        </w:tabs>
+        <w:ind w:left="5040" w:hanging="720"/>
+      </w:pPr>
+    </w:lvl>
+    <w:lvl w:ilvl="7">
+      <w:start w:val="1"/>
+      <w:numFmt w:val="decimal"/>
+      <w:lvlText w:val="%8."/>
+      <w:lvlJc w:val="left"/>
+      <w:pPr>
+        <w:tabs>
+          <w:tab w:val="num" w:pos="5760"/>
+        </w:tabs>
+        <w:ind w:left="5760" w:hanging="720"/>
+      </w:pPr>
+    </w:lvl>
+    <w:lvl w:ilvl="8">
+      <w:start w:val="1"/>
+      <w:numFmt w:val="decimal"/>
+      <w:lvlText w:val="%9."/>
+      <w:lvlJc w:val="left"/>
+      <w:pPr>
+        <w:tabs>
+          <w:tab w:val="num" w:pos="6480"/>
+        </w:tabs>
+        <w:ind w:left="6480" w:hanging="720"/>
+      </w:pPr>
+    </w:lvl>
+  </w:abstractNum>
+  <w:abstractNum w:abstractNumId="10" w15:restartNumberingAfterBreak="0">
+    <w:nsid w:val="64833ED0"/>
+    <w:multiLevelType w:val="multilevel"/>
+    <w:tmpl w:val="CF42CA54"/>
+    <w:lvl w:ilvl="0">
+      <w:start w:val="1"/>
+      <w:numFmt w:val="bullet"/>
+      <w:lvlText w:val=""/>
+      <w:lvlJc w:val="left"/>
+      <w:pPr>
+        <w:tabs>
+          <w:tab w:val="num" w:pos="720"/>
+        </w:tabs>
+        <w:ind w:left="720" w:hanging="360"/>
+      </w:pPr>
+      <w:rPr>
+        <w:rFonts w:ascii="Symbol" w:hAnsi="Symbol" w:hint="default"/>
+        <w:sz w:val="20"/>
+      </w:rPr>
+    </w:lvl>
+    <w:lvl w:ilvl="1" w:tentative="1">
+      <w:start w:val="1"/>
+      <w:numFmt w:val="bullet"/>
+      <w:lvlText w:val=""/>
+      <w:lvlJc w:val="left"/>
+      <w:pPr>
+        <w:tabs>
+          <w:tab w:val="num" w:pos="1440"/>
+        </w:tabs>
+        <w:ind w:left="1440" w:hanging="360"/>
+      </w:pPr>
+      <w:rPr>
+        <w:rFonts w:ascii="Symbol" w:hAnsi="Symbol" w:hint="default"/>
+        <w:sz w:val="20"/>
+      </w:rPr>
+    </w:lvl>
+    <w:lvl w:ilvl="2" w:tentative="1">
+      <w:start w:val="1"/>
+      <w:numFmt w:val="bullet"/>
+      <w:lvlText w:val=""/>
+      <w:lvlJc w:val="left"/>
+      <w:pPr>
+        <w:tabs>
+          <w:tab w:val="num" w:pos="2160"/>
+        </w:tabs>
+        <w:ind w:left="2160" w:hanging="360"/>
+      </w:pPr>
+      <w:rPr>
+        <w:rFonts w:ascii="Symbol" w:hAnsi="Symbol" w:hint="default"/>
+        <w:sz w:val="20"/>
+      </w:rPr>
+    </w:lvl>
+    <w:lvl w:ilvl="3" w:tentative="1">
+      <w:start w:val="1"/>
+      <w:numFmt w:val="bullet"/>
+      <w:lvlText w:val=""/>
+      <w:lvlJc w:val="left"/>
+      <w:pPr>
+        <w:tabs>
+          <w:tab w:val="num" w:pos="2880"/>
+        </w:tabs>
+        <w:ind w:left="2880" w:hanging="360"/>
+      </w:pPr>
+      <w:rPr>
+        <w:rFonts w:ascii="Symbol" w:hAnsi="Symbol" w:hint="default"/>
+        <w:sz w:val="20"/>
+      </w:rPr>
+    </w:lvl>
+    <w:lvl w:ilvl="4" w:tentative="1">
+      <w:start w:val="1"/>
+      <w:numFmt w:val="bullet"/>
+      <w:lvlText w:val=""/>
+      <w:lvlJc w:val="left"/>
+      <w:pPr>
+        <w:tabs>
+          <w:tab w:val="num" w:pos="3600"/>
+        </w:tabs>
+        <w:ind w:left="3600" w:hanging="360"/>
+      </w:pPr>
+      <w:rPr>
+        <w:rFonts w:ascii="Symbol" w:hAnsi="Symbol" w:hint="default"/>
+        <w:sz w:val="20"/>
+      </w:rPr>
+    </w:lvl>
+    <w:lvl w:ilvl="5" w:tentative="1">
+      <w:start w:val="1"/>
+      <w:numFmt w:val="bullet"/>
+      <w:lvlText w:val=""/>
+      <w:lvlJc w:val="left"/>
+      <w:pPr>
+        <w:tabs>
+          <w:tab w:val="num" w:pos="4320"/>
+        </w:tabs>
+        <w:ind w:left="4320" w:hanging="360"/>
+      </w:pPr>
+      <w:rPr>
+        <w:rFonts w:ascii="Symbol" w:hAnsi="Symbol" w:hint="default"/>
+        <w:sz w:val="20"/>
+      </w:rPr>
+    </w:lvl>
+    <w:lvl w:ilvl="6" w:tentative="1">
+      <w:start w:val="1"/>
+      <w:numFmt w:val="bullet"/>
+      <w:lvlText w:val=""/>
+      <w:lvlJc w:val="left"/>
+      <w:pPr>
+        <w:tabs>
+          <w:tab w:val="num" w:pos="5040"/>
+        </w:tabs>
+        <w:ind w:left="5040" w:hanging="360"/>
+      </w:pPr>
+      <w:rPr>
+        <w:rFonts w:ascii="Symbol" w:hAnsi="Symbol" w:hint="default"/>
+        <w:sz w:val="20"/>
+      </w:rPr>
+    </w:lvl>
+    <w:lvl w:ilvl="7" w:tentative="1">
+      <w:start w:val="1"/>
+      <w:numFmt w:val="bullet"/>
+      <w:lvlText w:val=""/>
+      <w:lvlJc w:val="left"/>
+      <w:pPr>
+        <w:tabs>
+          <w:tab w:val="num" w:pos="5760"/>
+        </w:tabs>
+        <w:ind w:left="5760" w:hanging="360"/>
+      </w:pPr>
+      <w:rPr>
+        <w:rFonts w:ascii="Symbol" w:hAnsi="Symbol" w:hint="default"/>
+        <w:sz w:val="20"/>
+      </w:rPr>
+    </w:lvl>
+    <w:lvl w:ilvl="8" w:tentative="1">
+      <w:start w:val="1"/>
+      <w:numFmt w:val="bullet"/>
+      <w:lvlText w:val=""/>
+      <w:lvlJc w:val="left"/>
+      <w:pPr>
+        <w:tabs>
+          <w:tab w:val="num" w:pos="6480"/>
+        </w:tabs>
+        <w:ind w:left="6480" w:hanging="360"/>
+      </w:pPr>
+      <w:rPr>
+        <w:rFonts w:ascii="Symbol" w:hAnsi="Symbol" w:hint="default"/>
+        <w:sz w:val="20"/>
+      </w:rPr>
+    </w:lvl>
+  </w:abstractNum>
+  <w:abstractNum w:abstractNumId="11" w15:restartNumberingAfterBreak="0">
+    <w:nsid w:val="75307454"/>
+    <w:multiLevelType w:val="multilevel"/>
+    <w:tmpl w:val="3864C318"/>
+    <w:lvl w:ilvl="0">
+      <w:start w:val="1"/>
+      <w:numFmt w:val="bullet"/>
+      <w:lvlText w:val=""/>
+      <w:lvlJc w:val="left"/>
+      <w:pPr>
+        <w:tabs>
+          <w:tab w:val="num" w:pos="720"/>
+        </w:tabs>
+        <w:ind w:left="720" w:hanging="360"/>
+      </w:pPr>
+      <w:rPr>
+        <w:rFonts w:ascii="Symbol" w:hAnsi="Symbol" w:hint="default"/>
+        <w:sz w:val="20"/>
+      </w:rPr>
+    </w:lvl>
+    <w:lvl w:ilvl="1" w:tentative="1">
+      <w:start w:val="1"/>
+      <w:numFmt w:val="bullet"/>
+      <w:lvlText w:val=""/>
+      <w:lvlJc w:val="left"/>
+      <w:pPr>
+        <w:tabs>
+          <w:tab w:val="num" w:pos="1440"/>
+        </w:tabs>
+        <w:ind w:left="1440" w:hanging="360"/>
+      </w:pPr>
+      <w:rPr>
+        <w:rFonts w:ascii="Symbol" w:hAnsi="Symbol" w:hint="default"/>
+        <w:sz w:val="20"/>
+      </w:rPr>
+    </w:lvl>
+    <w:lvl w:ilvl="2" w:tentative="1">
+      <w:start w:val="1"/>
+      <w:numFmt w:val="bullet"/>
+      <w:lvlText w:val=""/>
+      <w:lvlJc w:val="left"/>
+      <w:pPr>
+        <w:tabs>
+          <w:tab w:val="num" w:pos="2160"/>
+        </w:tabs>
+        <w:ind w:left="2160" w:hanging="360"/>
+      </w:pPr>
+      <w:rPr>
+        <w:rFonts w:ascii="Symbol" w:hAnsi="Symbol" w:hint="default"/>
+        <w:sz w:val="20"/>
+      </w:rPr>
+    </w:lvl>
+    <w:lvl w:ilvl="3" w:tentative="1">
+      <w:start w:val="1"/>
+      <w:numFmt w:val="bullet"/>
+      <w:lvlText w:val=""/>
+      <w:lvlJc w:val="left"/>
+      <w:pPr>
+        <w:tabs>
+          <w:tab w:val="num" w:pos="2880"/>
+        </w:tabs>
+        <w:ind w:left="2880" w:hanging="360"/>
+      </w:pPr>
+      <w:rPr>
+        <w:rFonts w:ascii="Symbol" w:hAnsi="Symbol" w:hint="default"/>
+        <w:sz w:val="20"/>
+      </w:rPr>
+    </w:lvl>
+    <w:lvl w:ilvl="4" w:tentative="1">
+      <w:start w:val="1"/>
+      <w:numFmt w:val="bullet"/>
+      <w:lvlText w:val=""/>
+      <w:lvlJc w:val="left"/>
+      <w:pPr>
+        <w:tabs>
+          <w:tab w:val="num" w:pos="3600"/>
+        </w:tabs>
+        <w:ind w:left="3600" w:hanging="360"/>
+      </w:pPr>
+      <w:rPr>
+        <w:rFonts w:ascii="Symbol" w:hAnsi="Symbol" w:hint="default"/>
+        <w:sz w:val="20"/>
+      </w:rPr>
+    </w:lvl>
+    <w:lvl w:ilvl="5" w:tentative="1">
+      <w:start w:val="1"/>
+      <w:numFmt w:val="bullet"/>
+      <w:lvlText w:val=""/>
+      <w:lvlJc w:val="left"/>
+      <w:pPr>
+        <w:tabs>
+          <w:tab w:val="num" w:pos="4320"/>
+        </w:tabs>
+        <w:ind w:left="4320" w:hanging="360"/>
+      </w:pPr>
+      <w:rPr>
+        <w:rFonts w:ascii="Symbol" w:hAnsi="Symbol" w:hint="default"/>
+        <w:sz w:val="20"/>
+      </w:rPr>
+    </w:lvl>
+    <w:lvl w:ilvl="6" w:tentative="1">
+      <w:start w:val="1"/>
+      <w:numFmt w:val="bullet"/>
+      <w:lvlText w:val=""/>
+      <w:lvlJc w:val="left"/>
+      <w:pPr>
+        <w:tabs>
+          <w:tab w:val="num" w:pos="5040"/>
+        </w:tabs>
+        <w:ind w:left="5040" w:hanging="360"/>
+      </w:pPr>
+      <w:rPr>
+        <w:rFonts w:ascii="Symbol" w:hAnsi="Symbol" w:hint="default"/>
+        <w:sz w:val="20"/>
+      </w:rPr>
+    </w:lvl>
+    <w:lvl w:ilvl="7" w:tentative="1">
+      <w:start w:val="1"/>
+      <w:numFmt w:val="bullet"/>
+      <w:lvlText w:val=""/>
+      <w:lvlJc w:val="left"/>
+      <w:pPr>
+        <w:tabs>
+          <w:tab w:val="num" w:pos="5760"/>
+        </w:tabs>
+        <w:ind w:left="5760" w:hanging="360"/>
+      </w:pPr>
+      <w:rPr>
+        <w:rFonts w:ascii="Symbol" w:hAnsi="Symbol" w:hint="default"/>
+        <w:sz w:val="20"/>
+      </w:rPr>
+    </w:lvl>
+    <w:lvl w:ilvl="8" w:tentative="1">
+      <w:start w:val="1"/>
+      <w:numFmt w:val="bullet"/>
+      <w:lvlText w:val=""/>
+      <w:lvlJc w:val="left"/>
+      <w:pPr>
+        <w:tabs>
+          <w:tab w:val="num" w:pos="6480"/>
+        </w:tabs>
+        <w:ind w:left="6480" w:hanging="360"/>
+      </w:pPr>
+      <w:rPr>
+        <w:rFonts w:ascii="Symbol" w:hAnsi="Symbol" w:hint="default"/>
+        <w:sz w:val="20"/>
+      </w:rPr>
+    </w:lvl>
+  </w:abstractNum>
+  <w:abstractNum w:abstractNumId="12" w15:restartNumberingAfterBreak="0">
+    <w:nsid w:val="76B429CF"/>
+    <w:multiLevelType w:val="multilevel"/>
+    <w:tmpl w:val="4A200446"/>
+    <w:lvl w:ilvl="0">
+      <w:start w:val="1"/>
+      <w:numFmt w:val="decimal"/>
+      <w:lvlText w:val="%1."/>
+      <w:lvlJc w:val="left"/>
+      <w:pPr>
+        <w:tabs>
+          <w:tab w:val="num" w:pos="720"/>
+        </w:tabs>
+        <w:ind w:left="720" w:hanging="720"/>
+      </w:pPr>
+    </w:lvl>
+    <w:lvl w:ilvl="1">
+      <w:start w:val="1"/>
+      <w:numFmt w:val="decimal"/>
+      <w:lvlText w:val="%2."/>
+      <w:lvlJc w:val="left"/>
+      <w:pPr>
+        <w:tabs>
+          <w:tab w:val="num" w:pos="1440"/>
+        </w:tabs>
+        <w:ind w:left="1440" w:hanging="720"/>
+      </w:pPr>
+    </w:lvl>
+    <w:lvl w:ilvl="2">
+      <w:start w:val="1"/>
+      <w:numFmt w:val="decimal"/>
+      <w:lvlText w:val="%3."/>
+      <w:lvlJc w:val="left"/>
+      <w:pPr>
+        <w:tabs>
+          <w:tab w:val="num" w:pos="2160"/>
+        </w:tabs>
+        <w:ind w:left="2160" w:hanging="720"/>
+      </w:pPr>
+    </w:lvl>
+    <w:lvl w:ilvl="3">
+      <w:start w:val="1"/>
+      <w:numFmt w:val="decimal"/>
+      <w:lvlText w:val="%4."/>
+      <w:lvlJc w:val="left"/>
+      <w:pPr>
+        <w:tabs>
+          <w:tab w:val="num" w:pos="2880"/>
+        </w:tabs>
+        <w:ind w:left="2880" w:hanging="720"/>
+      </w:pPr>
+    </w:lvl>
+    <w:lvl w:ilvl="4">
+      <w:start w:val="1"/>
+      <w:numFmt w:val="decimal"/>
+      <w:lvlText w:val="%5."/>
+      <w:lvlJc w:val="left"/>
+      <w:pPr>
+        <w:tabs>
+          <w:tab w:val="num" w:pos="3600"/>
+        </w:tabs>
+        <w:ind w:left="3600" w:hanging="720"/>
+      </w:pPr>
+    </w:lvl>
+    <w:lvl w:ilvl="5">
+      <w:start w:val="1"/>
+      <w:numFmt w:val="decimal"/>
+      <w:lvlText w:val="%6."/>
+      <w:lvlJc w:val="left"/>
+      <w:pPr>
+        <w:tabs>
+          <w:tab w:val="num" w:pos="4320"/>
+        </w:tabs>
+        <w:ind w:left="4320" w:hanging="720"/>
+      </w:pPr>
+    </w:lvl>
+    <w:lvl w:ilvl="6">
+      <w:start w:val="1"/>
+      <w:numFmt w:val="decimal"/>
+      <w:lvlText w:val="%7."/>
+      <w:lvlJc w:val="left"/>
+      <w:pPr>
+        <w:tabs>
+          <w:tab w:val="num" w:pos="5040"/>
+        </w:tabs>
+        <w:ind w:left="5040" w:hanging="720"/>
+      </w:pPr>
+    </w:lvl>
+    <w:lvl w:ilvl="7">
+      <w:start w:val="1"/>
+      <w:numFmt w:val="decimal"/>
+      <w:lvlText w:val="%8."/>
+      <w:lvlJc w:val="left"/>
+      <w:pPr>
+        <w:tabs>
+          <w:tab w:val="num" w:pos="5760"/>
+        </w:tabs>
+        <w:ind w:left="5760" w:hanging="720"/>
+      </w:pPr>
+    </w:lvl>
+    <w:lvl w:ilvl="8">
+      <w:start w:val="1"/>
+      <w:numFmt w:val="decimal"/>
+      <w:lvlText w:val="%9."/>
+      <w:lvlJc w:val="left"/>
+      <w:pPr>
+        <w:tabs>
+          <w:tab w:val="num" w:pos="6480"/>
+        </w:tabs>
+        <w:ind w:left="6480" w:hanging="720"/>
+      </w:pPr>
+    </w:lvl>
+  </w:abstractNum>
+  <w:abstractNum w:abstractNumId="13" w15:restartNumberingAfterBreak="0">
+    <w:nsid w:val="7AD4714C"/>
+    <w:multiLevelType w:val="multilevel"/>
+    <w:tmpl w:val="04102062"/>
+    <w:lvl w:ilvl="0">
+      <w:start w:val="1"/>
+      <w:numFmt w:val="bullet"/>
+      <w:lvlText w:val=""/>
+      <w:lvlJc w:val="left"/>
+      <w:pPr>
+        <w:tabs>
+          <w:tab w:val="num" w:pos="720"/>
+        </w:tabs>
+        <w:ind w:left="720" w:hanging="720"/>
+      </w:pPr>
+      <w:rPr>
+        <w:rFonts w:ascii="Symbol" w:hAnsi="Symbol" w:hint="default"/>
+      </w:rPr>
+    </w:lvl>
+    <w:lvl w:ilvl="1">
+      <w:start w:val="1"/>
+      <w:numFmt w:val="decimal"/>
+      <w:lvlText w:val="%2."/>
+      <w:lvlJc w:val="left"/>
+      <w:pPr>
+        <w:tabs>
+          <w:tab w:val="num" w:pos="1440"/>
+        </w:tabs>
+        <w:ind w:left="1440" w:hanging="720"/>
+      </w:pPr>
+    </w:lvl>
+    <w:lvl w:ilvl="2">
+      <w:start w:val="1"/>
+      <w:numFmt w:val="decimal"/>
+      <w:lvlText w:val="%3."/>
+      <w:lvlJc w:val="left"/>
+      <w:pPr>
+        <w:tabs>
+          <w:tab w:val="num" w:pos="2160"/>
+        </w:tabs>
+        <w:ind w:left="2160" w:hanging="720"/>
+      </w:pPr>
+    </w:lvl>
+    <w:lvl w:ilvl="3">
+      <w:start w:val="1"/>
+      <w:numFmt w:val="decimal"/>
+      <w:lvlText w:val="%4."/>
+      <w:lvlJc w:val="left"/>
+      <w:pPr>
+        <w:tabs>
+          <w:tab w:val="num" w:pos="2880"/>
+        </w:tabs>
+        <w:ind w:left="2880" w:hanging="720"/>
+      </w:pPr>
+    </w:lvl>
+    <w:lvl w:ilvl="4">
+      <w:start w:val="1"/>
+      <w:numFmt w:val="decimal"/>
+      <w:lvlText w:val="%5."/>
+      <w:lvlJc w:val="left"/>
+      <w:pPr>
+        <w:tabs>
+          <w:tab w:val="num" w:pos="3600"/>
+        </w:tabs>
+        <w:ind w:left="3600" w:hanging="720"/>
+      </w:pPr>
+    </w:lvl>
+    <w:lvl w:ilvl="5">
+      <w:start w:val="1"/>
+      <w:numFmt w:val="decimal"/>
+      <w:lvlText w:val="%6."/>
+      <w:lvlJc w:val="left"/>
+      <w:pPr>
+        <w:tabs>
+          <w:tab w:val="num" w:pos="4320"/>
+        </w:tabs>
+        <w:ind w:left="4320" w:hanging="720"/>
+      </w:pPr>
+    </w:lvl>
+    <w:lvl w:ilvl="6">
+      <w:start w:val="1"/>
+      <w:numFmt w:val="decimal"/>
+      <w:lvlText w:val="%7."/>
+      <w:lvlJc w:val="left"/>
+      <w:pPr>
+        <w:tabs>
+          <w:tab w:val="num" w:pos="5040"/>
+        </w:tabs>
+        <w:ind w:left="5040" w:hanging="720"/>
+      </w:pPr>
+    </w:lvl>
+    <w:lvl w:ilvl="7">
+      <w:start w:val="1"/>
+      <w:numFmt w:val="decimal"/>
+      <w:lvlText w:val="%8."/>
+      <w:lvlJc w:val="left"/>
+      <w:pPr>
+        <w:tabs>
+          <w:tab w:val="num" w:pos="5760"/>
+        </w:tabs>
+        <w:ind w:left="5760" w:hanging="720"/>
+      </w:pPr>
+    </w:lvl>
+    <w:lvl w:ilvl="8">
+      <w:start w:val="1"/>
+      <w:numFmt w:val="decimal"/>
+      <w:lvlText w:val="%9."/>
+      <w:lvlJc w:val="left"/>
+      <w:pPr>
+        <w:tabs>
+          <w:tab w:val="num" w:pos="6480"/>
+        </w:tabs>
+        <w:ind w:left="6480" w:hanging="720"/>
+      </w:pPr>
+    </w:lvl>
+  </w:abstractNum>
+  <w:num w:numId="1" w16cid:durableId="2092123372">
+    <w:abstractNumId w:val="5"/>
+    <w:lvlOverride w:ilvl="0">
+      <w:startOverride w:val="1"/>
+    </w:lvlOverride>
+  </w:num>
+  <w:num w:numId="2" w16cid:durableId="1182015376">
+    <w:abstractNumId w:val="5"/>
+    <w:lvlOverride w:ilvl="0">
+      <w:startOverride w:val="2"/>
+    </w:lvlOverride>
+  </w:num>
+  <w:num w:numId="3" w16cid:durableId="1094324387">
+    <w:abstractNumId w:val="2"/>
+    <w:lvlOverride w:ilvl="0">
+      <w:startOverride w:val="1"/>
+    </w:lvlOverride>
+  </w:num>
+  <w:num w:numId="4" w16cid:durableId="797723772">
+    <w:abstractNumId w:val="2"/>
+    <w:lvlOverride w:ilvl="0">
+      <w:startOverride w:val="2"/>
+    </w:lvlOverride>
+  </w:num>
+  <w:num w:numId="5" w16cid:durableId="1006516934">
+    <w:abstractNumId w:val="4"/>
+    <w:lvlOverride w:ilvl="0">
+      <w:startOverride w:val="1"/>
+    </w:lvlOverride>
+  </w:num>
+  <w:num w:numId="6" w16cid:durableId="561715110">
+    <w:abstractNumId w:val="4"/>
+    <w:lvlOverride w:ilvl="0">
+      <w:startOverride w:val="2"/>
+    </w:lvlOverride>
+  </w:num>
+  <w:num w:numId="7" w16cid:durableId="1133016908">
+    <w:abstractNumId w:val="6"/>
+    <w:lvlOverride w:ilvl="0">
+      <w:startOverride w:val="1"/>
+    </w:lvlOverride>
+  </w:num>
+  <w:num w:numId="8" w16cid:durableId="1027950382">
+    <w:abstractNumId w:val="6"/>
+    <w:lvlOverride w:ilvl="0">
+      <w:startOverride w:val="2"/>
+    </w:lvlOverride>
+  </w:num>
+  <w:num w:numId="9" w16cid:durableId="1260943909">
+    <w:abstractNumId w:val="8"/>
+  </w:num>
+  <w:num w:numId="10" w16cid:durableId="962542153">
+    <w:abstractNumId w:val="8"/>
+    <w:lvlOverride w:ilvl="0">
+      <w:startOverride w:val="1"/>
+    </w:lvlOverride>
+    <w:lvlOverride w:ilvl="1">
+      <w:startOverride w:val="1"/>
+    </w:lvlOverride>
+    <w:lvlOverride w:ilvl="2">
+      <w:startOverride w:val="1"/>
+    </w:lvlOverride>
+    <w:lvlOverride w:ilvl="3">
+      <w:startOverride w:val="1"/>
+    </w:lvlOverride>
+    <w:lvlOverride w:ilvl="4">
+      <w:startOverride w:val="1"/>
+    </w:lvlOverride>
+    <w:lvlOverride w:ilvl="5">
+      <w:startOverride w:val="1"/>
+    </w:lvlOverride>
+    <w:lvlOverride w:ilvl="6">
+      <w:startOverride w:val="1"/>
+    </w:lvlOverride>
+    <w:lvlOverride w:ilvl="7">
+      <w:startOverride w:val="1"/>
+    </w:lvlOverride>
+    <w:lvlOverride w:ilvl="8">
+      <w:startOverride w:val="1"/>
+    </w:lvlOverride>
+  </w:num>
+  <w:num w:numId="11" w16cid:durableId="1380594728">
+    <w:abstractNumId w:val="8"/>
+    <w:lvlOverride w:ilvl="0">
+      <w:startOverride w:val="1"/>
+    </w:lvlOverride>
+    <w:lvlOverride w:ilvl="1">
+      <w:startOverride w:val="1"/>
+    </w:lvlOverride>
+    <w:lvlOverride w:ilvl="2">
+      <w:startOverride w:val="1"/>
+    </w:lvlOverride>
+    <w:lvlOverride w:ilvl="3">
+      <w:startOverride w:val="1"/>
+    </w:lvlOverride>
+    <w:lvlOverride w:ilvl="4">
+      <w:startOverride w:val="1"/>
+    </w:lvlOverride>
+    <w:lvlOverride w:ilvl="5">
+      <w:startOverride w:val="1"/>
+    </w:lvlOverride>
+    <w:lvlOverride w:ilvl="6">
+      <w:startOverride w:val="1"/>
+    </w:lvlOverride>
+    <w:lvlOverride w:ilvl="7">
+      <w:startOverride w:val="1"/>
+    </w:lvlOverride>
+    <w:lvlOverride w:ilvl="8">
+      <w:startOverride w:val="1"/>
+    </w:lvlOverride>
+  </w:num>
+  <w:num w:numId="12" w16cid:durableId="394165280">
+    <w:abstractNumId w:val="8"/>
+    <w:lvlOverride w:ilvl="0">
+      <w:startOverride w:val="1"/>
+    </w:lvlOverride>
+    <w:lvlOverride w:ilvl="1">
+      <w:startOverride w:val="1"/>
+    </w:lvlOverride>
+    <w:lvlOverride w:ilvl="2">
+      <w:startOverride w:val="1"/>
+    </w:lvlOverride>
+    <w:lvlOverride w:ilvl="3">
+      <w:startOverride w:val="1"/>
+    </w:lvlOverride>
+    <w:lvlOverride w:ilvl="4">
+      <w:startOverride w:val="1"/>
+    </w:lvlOverride>
+    <w:lvlOverride w:ilvl="5">
+      <w:startOverride w:val="1"/>
+    </w:lvlOverride>
+    <w:lvlOverride w:ilvl="6">
+      <w:startOverride w:val="1"/>
+    </w:lvlOverride>
+    <w:lvlOverride w:ilvl="7">
+      <w:startOverride w:val="1"/>
+    </w:lvlOverride>
+    <w:lvlOverride w:ilvl="8">
+      <w:startOverride w:val="1"/>
+    </w:lvlOverride>
+  </w:num>
+  <w:num w:numId="13" w16cid:durableId="952596123">
+    <w:abstractNumId w:val="8"/>
+    <w:lvlOverride w:ilvl="0">
+      <w:startOverride w:val="1"/>
+    </w:lvlOverride>
+    <w:lvlOverride w:ilvl="1">
+      <w:startOverride w:val="1"/>
+    </w:lvlOverride>
+    <w:lvlOverride w:ilvl="2">
+      <w:startOverride w:val="1"/>
+    </w:lvlOverride>
+    <w:lvlOverride w:ilvl="3">
+      <w:startOverride w:val="1"/>
+    </w:lvlOverride>
+    <w:lvlOverride w:ilvl="4">
+      <w:startOverride w:val="1"/>
+    </w:lvlOverride>
+    <w:lvlOverride w:ilvl="5">
+      <w:startOverride w:val="1"/>
+    </w:lvlOverride>
+    <w:lvlOverride w:ilvl="6">
+      <w:startOverride w:val="1"/>
+    </w:lvlOverride>
+    <w:lvlOverride w:ilvl="7">
+      <w:startOverride w:val="1"/>
+    </w:lvlOverride>
+    <w:lvlOverride w:ilvl="8">
+      <w:startOverride w:val="1"/>
+    </w:lvlOverride>
+  </w:num>
+  <w:num w:numId="14" w16cid:durableId="2026511703">
+    <w:abstractNumId w:val="8"/>
+    <w:lvlOverride w:ilvl="0">
+      <w:startOverride w:val="1"/>
+    </w:lvlOverride>
+    <w:lvlOverride w:ilvl="1">
+      <w:startOverride w:val="1"/>
+    </w:lvlOverride>
+    <w:lvlOverride w:ilvl="2">
+      <w:startOverride w:val="1"/>
+    </w:lvlOverride>
+    <w:lvlOverride w:ilvl="3">
+      <w:startOverride w:val="1"/>
+    </w:lvlOverride>
+    <w:lvlOverride w:ilvl="4">
+      <w:startOverride w:val="1"/>
+    </w:lvlOverride>
+    <w:lvlOverride w:ilvl="5">
+      <w:startOverride w:val="1"/>
+    </w:lvlOverride>
+    <w:lvlOverride w:ilvl="6">
+      <w:startOverride w:val="1"/>
+    </w:lvlOverride>
+    <w:lvlOverride w:ilvl="7">
+      <w:startOverride w:val="1"/>
+    </w:lvlOverride>
+    <w:lvlOverride w:ilvl="8">
+      <w:startOverride w:val="1"/>
+    </w:lvlOverride>
+  </w:num>
+  <w:num w:numId="15" w16cid:durableId="1240402256">
+    <w:abstractNumId w:val="8"/>
+    <w:lvlOverride w:ilvl="0">
+      <w:startOverride w:val="1"/>
+    </w:lvlOverride>
+    <w:lvlOverride w:ilvl="1">
+      <w:startOverride w:val="1"/>
+    </w:lvlOverride>
+    <w:lvlOverride w:ilvl="2">
+      <w:startOverride w:val="1"/>
+    </w:lvlOverride>
+    <w:lvlOverride w:ilvl="3">
+      <w:startOverride w:val="1"/>
+    </w:lvlOverride>
+    <w:lvlOverride w:ilvl="4">
+      <w:startOverride w:val="1"/>
+    </w:lvlOverride>
+    <w:lvlOverride w:ilvl="5">
+      <w:startOverride w:val="1"/>
+    </w:lvlOverride>
+    <w:lvlOverride w:ilvl="6">
+      <w:startOverride w:val="1"/>
+    </w:lvlOverride>
+    <w:lvlOverride w:ilvl="7">
+      <w:startOverride w:val="1"/>
+    </w:lvlOverride>
+    <w:lvlOverride w:ilvl="8">
+      <w:startOverride w:val="1"/>
+    </w:lvlOverride>
+  </w:num>
+  <w:num w:numId="16" w16cid:durableId="79644294">
+    <w:abstractNumId w:val="8"/>
+    <w:lvlOverride w:ilvl="0">
+      <w:startOverride w:val="1"/>
+    </w:lvlOverride>
+    <w:lvlOverride w:ilvl="1">
+      <w:startOverride w:val="1"/>
+    </w:lvlOverride>
+    <w:lvlOverride w:ilvl="2">
+      <w:startOverride w:val="1"/>
+    </w:lvlOverride>
+    <w:lvlOverride w:ilvl="3">
+      <w:startOverride w:val="1"/>
+    </w:lvlOverride>
+    <w:lvlOverride w:ilvl="4">
+      <w:startOverride w:val="1"/>
+    </w:lvlOverride>
+    <w:lvlOverride w:ilvl="5">
+      <w:startOverride w:val="1"/>
+    </w:lvlOverride>
+    <w:lvlOverride w:ilvl="6">
+      <w:startOverride w:val="1"/>
+    </w:lvlOverride>
+    <w:lvlOverride w:ilvl="7">
+      <w:startOverride w:val="1"/>
+    </w:lvlOverride>
+    <w:lvlOverride w:ilvl="8">
+      <w:startOverride w:val="1"/>
+    </w:lvlOverride>
+  </w:num>
+  <w:num w:numId="17" w16cid:durableId="1563370536">
+    <w:abstractNumId w:val="7"/>
+    <w:lvlOverride w:ilvl="0">
+      <w:startOverride w:val="1"/>
+    </w:lvlOverride>
+  </w:num>
+  <w:num w:numId="18" w16cid:durableId="1579635107">
+    <w:abstractNumId w:val="7"/>
+    <w:lvlOverride w:ilvl="0">
+      <w:startOverride w:val="2"/>
+    </w:lvlOverride>
+  </w:num>
+  <w:num w:numId="19" w16cid:durableId="322123056">
+    <w:abstractNumId w:val="3"/>
+  </w:num>
+  <w:num w:numId="20" w16cid:durableId="568617005">
+    <w:abstractNumId w:val="3"/>
+    <w:lvlOverride w:ilvl="0">
+      <w:startOverride w:val="1"/>
+    </w:lvlOverride>
+    <w:lvlOverride w:ilvl="1">
+      <w:startOverride w:val="1"/>
+    </w:lvlOverride>
+    <w:lvlOverride w:ilvl="2">
+      <w:startOverride w:val="1"/>
+    </w:lvlOverride>
+    <w:lvlOverride w:ilvl="3">
+      <w:startOverride w:val="1"/>
+    </w:lvlOverride>
+    <w:lvlOverride w:ilvl="4">
+      <w:startOverride w:val="1"/>
+    </w:lvlOverride>
+    <w:lvlOverride w:ilvl="5">
+      <w:startOverride w:val="1"/>
+    </w:lvlOverride>
+    <w:lvlOverride w:ilvl="6">
+      <w:startOverride w:val="1"/>
+    </w:lvlOverride>
+    <w:lvlOverride w:ilvl="7">
+      <w:startOverride w:val="1"/>
+    </w:lvlOverride>
+    <w:lvlOverride w:ilvl="8">
+      <w:startOverride w:val="1"/>
+    </w:lvlOverride>
+  </w:num>
+  <w:num w:numId="21" w16cid:durableId="875508567">
+    <w:abstractNumId w:val="9"/>
+  </w:num>
+  <w:num w:numId="22" w16cid:durableId="1560020510">
+    <w:abstractNumId w:val="10"/>
+    <w:lvlOverride w:ilvl="0">
+      <w:startOverride w:val="1"/>
+    </w:lvlOverride>
+  </w:num>
+  <w:num w:numId="23" w16cid:durableId="1387798934">
+    <w:abstractNumId w:val="10"/>
+    <w:lvlOverride w:ilvl="0">
+      <w:startOverride w:val="2"/>
+    </w:lvlOverride>
+  </w:num>
+  <w:num w:numId="24" w16cid:durableId="1853566803">
+    <w:abstractNumId w:val="11"/>
+    <w:lvlOverride w:ilvl="0">
+      <w:startOverride w:val="1"/>
+    </w:lvlOverride>
+  </w:num>
+  <w:num w:numId="25" w16cid:durableId="133528829">
+    <w:abstractNumId w:val="1"/>
+  </w:num>
+  <w:num w:numId="26" w16cid:durableId="1554732289">
+    <w:abstractNumId w:val="1"/>
+    <w:lvlOverride w:ilvl="0">
+      <w:startOverride w:val="1"/>
+    </w:lvlOverride>
+    <w:lvlOverride w:ilvl="1">
+      <w:startOverride w:val="1"/>
+    </w:lvlOverride>
+    <w:lvlOverride w:ilvl="2">
+      <w:startOverride w:val="1"/>
+    </w:lvlOverride>
+    <w:lvlOverride w:ilvl="3">
+      <w:startOverride w:val="1"/>
+    </w:lvlOverride>
+    <w:lvlOverride w:ilvl="4">
+      <w:startOverride w:val="1"/>
+    </w:lvlOverride>
+    <w:lvlOverride w:ilvl="5">
+      <w:startOverride w:val="1"/>
+    </w:lvlOverride>
+    <w:lvlOverride w:ilvl="6">
+      <w:startOverride w:val="1"/>
+    </w:lvlOverride>
+    <w:lvlOverride w:ilvl="7">
+      <w:startOverride w:val="1"/>
+    </w:lvlOverride>
+    <w:lvlOverride w:ilvl="8">
+      <w:startOverride w:val="1"/>
+    </w:lvlOverride>
+  </w:num>
+  <w:num w:numId="27" w16cid:durableId="1646351075">
+    <w:abstractNumId w:val="1"/>
+    <w:lvlOverride w:ilvl="0">
+      <w:startOverride w:val="1"/>
+    </w:lvlOverride>
+    <w:lvlOverride w:ilvl="1">
+      <w:startOverride w:val="1"/>
+    </w:lvlOverride>
+    <w:lvlOverride w:ilvl="2">
+      <w:startOverride w:val="1"/>
+    </w:lvlOverride>
+    <w:lvlOverride w:ilvl="3">
+      <w:startOverride w:val="1"/>
+    </w:lvlOverride>
+    <w:lvlOverride w:ilvl="4">
+      <w:startOverride w:val="1"/>
+    </w:lvlOverride>
+    <w:lvlOverride w:ilvl="5">
+      <w:startOverride w:val="1"/>
+    </w:lvlOverride>
+    <w:lvlOverride w:ilvl="6">
+      <w:startOverride w:val="1"/>
+    </w:lvlOverride>
+    <w:lvlOverride w:ilvl="7">
+      <w:startOverride w:val="1"/>
+    </w:lvlOverride>
+    <w:lvlOverride w:ilvl="8">
+      <w:startOverride w:val="1"/>
+    </w:lvlOverride>
+  </w:num>
+  <w:num w:numId="28" w16cid:durableId="572785693">
+    <w:abstractNumId w:val="12"/>
+  </w:num>
+  <w:num w:numId="29" w16cid:durableId="112408107">
+    <w:abstractNumId w:val="12"/>
+    <w:lvlOverride w:ilvl="0">
+      <w:startOverride w:val="1"/>
+    </w:lvlOverride>
+    <w:lvlOverride w:ilvl="1">
+      <w:startOverride w:val="1"/>
+    </w:lvlOverride>
+    <w:lvlOverride w:ilvl="2">
+      <w:startOverride w:val="1"/>
+    </w:lvlOverride>
+    <w:lvlOverride w:ilvl="3">
+      <w:startOverride w:val="1"/>
+    </w:lvlOverride>
+    <w:lvlOverride w:ilvl="4">
+      <w:startOverride w:val="1"/>
+    </w:lvlOverride>
+    <w:lvlOverride w:ilvl="5">
+      <w:startOverride w:val="1"/>
+    </w:lvlOverride>
+    <w:lvlOverride w:ilvl="6">
+      <w:startOverride w:val="1"/>
+    </w:lvlOverride>
+    <w:lvlOverride w:ilvl="7">
+      <w:startOverride w:val="1"/>
+    </w:lvlOverride>
+    <w:lvlOverride w:ilvl="8">
+      <w:startOverride w:val="1"/>
+    </w:lvlOverride>
+  </w:num>
+  <w:num w:numId="30" w16cid:durableId="1366713536">
+    <w:abstractNumId w:val="12"/>
+    <w:lvlOverride w:ilvl="0">
+      <w:startOverride w:val="1"/>
+    </w:lvlOverride>
+    <w:lvlOverride w:ilvl="1">
+      <w:startOverride w:val="1"/>
+    </w:lvlOverride>
+    <w:lvlOverride w:ilvl="2">
+      <w:startOverride w:val="1"/>
+    </w:lvlOverride>
+    <w:lvlOverride w:ilvl="3">
+      <w:startOverride w:val="1"/>
+    </w:lvlOverride>
+    <w:lvlOverride w:ilvl="4">
+      <w:startOverride w:val="1"/>
+    </w:lvlOverride>
+    <w:lvlOverride w:ilvl="5">
+      <w:startOverride w:val="1"/>
+    </w:lvlOverride>
+    <w:lvlOverride w:ilvl="6">
+      <w:startOverride w:val="1"/>
+    </w:lvlOverride>
+    <w:lvlOverride w:ilvl="7">
+      <w:startOverride w:val="1"/>
+    </w:lvlOverride>
+    <w:lvlOverride w:ilvl="8">
+      <w:startOverride w:val="1"/>
+    </w:lvlOverride>
+  </w:num>
+  <w:num w:numId="31" w16cid:durableId="908419825">
+    <w:abstractNumId w:val="0"/>
+  </w:num>
+  <w:num w:numId="32" w16cid:durableId="880900323">
+    <w:abstractNumId w:val="13"/>
+  </w:num>
+</w:numbering>
 </file>
 
 <file path=word/styles.xml><?xml version="1.0" encoding="utf-8"?>
@@ -828,7 +3536,7 @@
   <w:style w:type="paragraph" w:default="1" w:styleId="Normal">
     <w:name w:val="Normal"/>
     <w:qFormat/>
-    <w:rsid w:val="00D61B20"/>
+    <w:rsid w:val="00DA0C7C"/>
     <w:pPr>
       <w:spacing w:after="0" w:line="240" w:lineRule="auto"/>
     </w:pPr>

</xml_diff>

<commit_message>
Priprava 20251003 II cast
</commit_message>
<xml_diff>
--- a/IT_hodiny/namety_postupu_skolenia.docx
+++ b/IT_hodiny/namety_postupu_skolenia.docx
@@ -1118,13 +1118,7 @@
     </w:p>
     <w:p>
       <w:r>
-        <w:t>Zmena farby pri každom stl</w:t>
-      </w:r>
-      <w:r>
-        <w:t>a</w:t>
-      </w:r>
-      <w:r>
-        <w:t xml:space="preserve">čení myši program </w:t>
+        <w:t xml:space="preserve">Zmena farby pri každom stlačení myši program </w:t>
       </w:r>
     </w:p>
     <w:p/>
@@ -1203,9 +1197,35 @@
         <w:t>Prepodkaldám, že táto problematika je ešte príliš zložitá pre Kubiho.</w:t>
       </w:r>
     </w:p>
+    <w:p>
+      <w:pPr>
+        <w:pStyle w:val="Heading3"/>
+      </w:pPr>
+      <w:r>
+        <w:t>How to get keyboard input in PyGame ?</w:t>
+      </w:r>
+    </w:p>
+    <w:p>
+      <w:hyperlink r:id="rId19" w:history="1">
+        <w:r>
+          <w:rPr>
+            <w:rStyle w:val="Hyperlink"/>
+          </w:rPr>
+          <w:t>https://www.geeksforgeeks.org/python/how-to-get-keyboard-input-in-pygame/</w:t>
+        </w:r>
+      </w:hyperlink>
+      <w:r>
+        <w:t xml:space="preserve"> </w:t>
+      </w:r>
+    </w:p>
+    <w:p>
+      <w:r>
+        <w:t>Program ukazuje problematiku vnútornej hodnoty stlačenej klávesy</w:t>
+      </w:r>
+    </w:p>
     <w:p/>
     <w:sectPr>
-      <w:footerReference w:type="default" r:id="rId19"/>
+      <w:footerReference w:type="default" r:id="rId20"/>
       <w:pgSz w:w="11906" w:h="16838"/>
       <w:pgMar w:top="1440" w:right="1440" w:bottom="1440" w:left="1440" w:header="708" w:footer="708" w:gutter="0"/>
       <w:cols w:space="708"/>

</xml_diff>